<commit_message>
Fin site vitrine statique
</commit_message>
<xml_diff>
--- a/CEJM/BTS SIO 1/Recherche de stage/Liste entreprises.docx
+++ b/CEJM/BTS SIO 1/Recherche de stage/Liste entreprises.docx
@@ -377,7 +377,15 @@
           </w:tcPr>
           <w:p>
             <w:r>
-              <w:t>9 Rue des Chaprais, 25000 Besançon</w:t>
+              <w:t xml:space="preserve">9 Rue des </w:t>
+            </w:r>
+            <w:proofErr w:type="spellStart"/>
+            <w:r>
+              <w:t>Chaprais</w:t>
+            </w:r>
+            <w:proofErr w:type="spellEnd"/>
+            <w:r>
+              <w:t>, 25000 Besançon</w:t>
             </w:r>
             <w:r>
               <w:br/>
@@ -499,7 +507,15 @@
           </w:tcPr>
           <w:p>
             <w:r>
-              <w:t>2 G, avenue des Montboucons Temis, 25000 Besançon</w:t>
+              <w:t xml:space="preserve">2 G, avenue des Montboucons </w:t>
+            </w:r>
+            <w:proofErr w:type="spellStart"/>
+            <w:r>
+              <w:t>Temis</w:t>
+            </w:r>
+            <w:proofErr w:type="spellEnd"/>
+            <w:r>
+              <w:t>, 25000 Besançon</w:t>
             </w:r>
             <w:r>
               <w:br/>
@@ -508,8 +524,13 @@
               <w:t>Email :</w:t>
             </w:r>
             <w:r>
-              <w:t xml:space="preserve"> info.fr@arkance.world</w:t>
-            </w:r>
+              <w:t xml:space="preserve"> </w:t>
+            </w:r>
+            <w:proofErr w:type="spellStart"/>
+            <w:r>
+              <w:t>info.fr@arkance.world</w:t>
+            </w:r>
+            <w:proofErr w:type="spellEnd"/>
             <w:r>
               <w:br/>
             </w:r>
@@ -610,20 +631,30 @@
               <w:rPr>
                 <w:lang w:val="en-US"/>
               </w:rPr>
-              <w:t>22 Rue Thomas Edison, 25000 Besançon</w:t>
-            </w:r>
+              <w:t xml:space="preserve">22 Rue Thomas Edison, 25000 </w:t>
+            </w:r>
+            <w:proofErr w:type="spellStart"/>
+            <w:r>
+              <w:rPr>
+                <w:lang w:val="en-US"/>
+              </w:rPr>
+              <w:t>Besançon</w:t>
+            </w:r>
+            <w:proofErr w:type="spellEnd"/>
             <w:r>
               <w:rPr>
                 <w:lang w:val="en-US"/>
               </w:rPr>
               <w:br/>
             </w:r>
+            <w:proofErr w:type="gramStart"/>
             <w:r>
               <w:rPr>
                 <w:lang w:val="en-US"/>
               </w:rPr>
               <w:t>Tel :</w:t>
             </w:r>
+            <w:proofErr w:type="gramEnd"/>
             <w:r>
               <w:rPr>
                 <w:lang w:val="en-US"/>
@@ -714,8 +745,13 @@
             <w:tcW w:w="1402" w:type="dxa"/>
           </w:tcPr>
           <w:p>
-            <w:r>
-              <w:t>Izyos l'informatique Durable</w:t>
+            <w:proofErr w:type="spellStart"/>
+            <w:r>
+              <w:t>Izyos</w:t>
+            </w:r>
+            <w:proofErr w:type="spellEnd"/>
+            <w:r>
+              <w:t xml:space="preserve"> l'informatique Durable</w:t>
             </w:r>
           </w:p>
         </w:tc>
@@ -785,7 +821,15 @@
           </w:tcPr>
           <w:p>
             <w:r>
-              <w:t>1 Rue du Baron Daclin, 25000 Besançon</w:t>
+              <w:t xml:space="preserve">1 Rue du Baron </w:t>
+            </w:r>
+            <w:proofErr w:type="spellStart"/>
+            <w:r>
+              <w:t>Daclin</w:t>
+            </w:r>
+            <w:proofErr w:type="spellEnd"/>
+            <w:r>
+              <w:t>, 25000 Besançon</w:t>
             </w:r>
             <w:r>
               <w:br/>
@@ -967,7 +1011,15 @@
           </w:tcPr>
           <w:p>
             <w:r>
-              <w:t>48 Rue des Founottes, 25000 Besançon</w:t>
+              <w:t xml:space="preserve">48 Rue des </w:t>
+            </w:r>
+            <w:proofErr w:type="spellStart"/>
+            <w:r>
+              <w:t>Founottes</w:t>
+            </w:r>
+            <w:proofErr w:type="spellEnd"/>
+            <w:r>
+              <w:t>, 25000 Besançon</w:t>
             </w:r>
             <w:r>
               <w:br/>
@@ -1085,9 +1137,11 @@
             <w:r>
               <w:t xml:space="preserve"> </w:t>
             </w:r>
+            <w:proofErr w:type="spellStart"/>
             <w:r>
               <w:t>contact@numerique.email</w:t>
             </w:r>
+            <w:proofErr w:type="spellEnd"/>
             <w:r>
               <w:br/>
             </w:r>
@@ -1137,7 +1191,15 @@
           </w:tcPr>
           <w:p>
             <w:r>
-              <w:t>32 Rue Megevand, 25000 Besançon</w:t>
+              <w:t xml:space="preserve">32 Rue </w:t>
+            </w:r>
+            <w:proofErr w:type="spellStart"/>
+            <w:r>
+              <w:t>Megevand</w:t>
+            </w:r>
+            <w:proofErr w:type="spellEnd"/>
+            <w:r>
+              <w:t>, 25000 Besançon</w:t>
             </w:r>
             <w:r>
               <w:br/>
@@ -1249,7 +1311,15 @@
           </w:tcPr>
           <w:p>
             <w:r>
-              <w:t>2 Rue Megevand, 25000 Besançon</w:t>
+              <w:t xml:space="preserve">2 Rue </w:t>
+            </w:r>
+            <w:proofErr w:type="spellStart"/>
+            <w:r>
+              <w:t>Megevand</w:t>
+            </w:r>
+            <w:proofErr w:type="spellEnd"/>
+            <w:r>
+              <w:t>, 25000 Besançon</w:t>
             </w:r>
             <w:r>
               <w:br/>
@@ -1349,8 +1419,13 @@
           </w:tcPr>
           <w:p>
             <w:r>
-              <w:t>La Boutic</w:t>
-            </w:r>
+              <w:t xml:space="preserve">La </w:t>
+            </w:r>
+            <w:proofErr w:type="spellStart"/>
+            <w:r>
+              <w:t>Boutic</w:t>
+            </w:r>
+            <w:proofErr w:type="spellEnd"/>
           </w:p>
         </w:tc>
         <w:tc>
@@ -1411,9 +1486,11 @@
             <w:tcW w:w="1402" w:type="dxa"/>
           </w:tcPr>
           <w:p>
+            <w:proofErr w:type="spellStart"/>
             <w:r>
               <w:t>Hylæ</w:t>
             </w:r>
+            <w:proofErr w:type="spellEnd"/>
           </w:p>
         </w:tc>
         <w:tc>
@@ -1535,9 +1612,11 @@
             <w:tcW w:w="1402" w:type="dxa"/>
           </w:tcPr>
           <w:p>
+            <w:proofErr w:type="spellStart"/>
             <w:r>
               <w:t>Flexio</w:t>
             </w:r>
+            <w:proofErr w:type="spellEnd"/>
           </w:p>
         </w:tc>
         <w:tc>
@@ -1597,7 +1676,15 @@
           </w:tcPr>
           <w:p>
             <w:r>
-              <w:t>48 Rue des Founottes, 25000 Besançon</w:t>
+              <w:t xml:space="preserve">48 Rue des </w:t>
+            </w:r>
+            <w:proofErr w:type="spellStart"/>
+            <w:r>
+              <w:t>Founottes</w:t>
+            </w:r>
+            <w:proofErr w:type="spellEnd"/>
+            <w:r>
+              <w:t>, 25000 Besançon</w:t>
             </w:r>
             <w:r>
               <w:br/>
@@ -1742,7 +1829,15 @@
           </w:tcPr>
           <w:p>
             <w:r>
-              <w:t>40 Rue des Frères Chaffanjon, 25000 Besançon</w:t>
+              <w:t xml:space="preserve">40 Rue des Frères </w:t>
+            </w:r>
+            <w:proofErr w:type="spellStart"/>
+            <w:r>
+              <w:t>Chaffanjon</w:t>
+            </w:r>
+            <w:proofErr w:type="spellEnd"/>
+            <w:r>
+              <w:t>, 25000 Besançon</w:t>
             </w:r>
           </w:p>
           <w:p>
@@ -2070,9 +2165,11 @@
             <w:tcW w:w="1402" w:type="dxa"/>
           </w:tcPr>
           <w:p>
+            <w:proofErr w:type="spellStart"/>
             <w:r>
               <w:t>CashMag</w:t>
             </w:r>
+            <w:proofErr w:type="spellEnd"/>
           </w:p>
         </w:tc>
         <w:tc>
@@ -2123,7 +2220,15 @@
           </w:tcPr>
           <w:p>
             <w:r>
-              <w:t>20 rue du Chasnot 25000 Besançon</w:t>
+              <w:t xml:space="preserve">20 rue du </w:t>
+            </w:r>
+            <w:proofErr w:type="spellStart"/>
+            <w:r>
+              <w:t>Chasnot</w:t>
+            </w:r>
+            <w:proofErr w:type="spellEnd"/>
+            <w:r>
+              <w:t xml:space="preserve"> 25000 Besançon</w:t>
             </w:r>
           </w:p>
         </w:tc>
@@ -2538,9 +2643,11 @@
             <w:tcW w:w="1402" w:type="dxa"/>
           </w:tcPr>
           <w:p>
+            <w:proofErr w:type="spellStart"/>
             <w:r>
               <w:t>DynAgence</w:t>
             </w:r>
+            <w:proofErr w:type="spellEnd"/>
           </w:p>
         </w:tc>
         <w:tc>
@@ -2714,8 +2821,13 @@
           </w:tcPr>
           <w:p>
             <w:r>
-              <w:t>4 chemin du fort de Bregille</w:t>
-            </w:r>
+              <w:t xml:space="preserve">4 chemin du fort de </w:t>
+            </w:r>
+            <w:proofErr w:type="spellStart"/>
+            <w:r>
+              <w:t>Bregille</w:t>
+            </w:r>
+            <w:proofErr w:type="spellEnd"/>
             <w:r>
               <w:br/>
               <w:t>25000 Besançon</w:t>
@@ -2821,7 +2933,7 @@
           </w:tcPr>
           <w:p>
             <w:r>
-              <w:t>Fromageries Marcel Petite SAS</w:t>
+              <w:t>GENDARMERIE NATIONALE</w:t>
             </w:r>
           </w:p>
         </w:tc>
@@ -2829,19 +2941,45 @@
           <w:tcPr>
             <w:tcW w:w="2713" w:type="dxa"/>
           </w:tcPr>
-          <w:p/>
+          <w:p>
+            <w:r>
+              <w:t>39 rue Charles</w:t>
+            </w:r>
+            <w:r>
+              <w:t xml:space="preserve"> </w:t>
+            </w:r>
+            <w:r>
+              <w:t>Nodier 25000 Besançon</w:t>
+            </w:r>
+          </w:p>
+          <w:p>
+            <w:r>
+              <w:t xml:space="preserve">Tel : </w:t>
+            </w:r>
+            <w:r>
+              <w:t>03 81 81 32 23</w:t>
+            </w:r>
+          </w:p>
         </w:tc>
         <w:tc>
           <w:tcPr>
             <w:tcW w:w="3813" w:type="dxa"/>
           </w:tcPr>
-          <w:p/>
+          <w:p>
+            <w:r>
+              <w:t>https://www.gendarmerie.interieur.gouv.fr/</w:t>
+            </w:r>
+          </w:p>
         </w:tc>
         <w:tc>
           <w:tcPr>
             <w:tcW w:w="928" w:type="dxa"/>
           </w:tcPr>
-          <w:p/>
+          <w:p>
+            <w:r>
+              <w:t>Envoyé</w:t>
+            </w:r>
+          </w:p>
         </w:tc>
       </w:tr>
       <w:tr>
@@ -2851,7 +2989,7 @@
           </w:tcPr>
           <w:p>
             <w:r>
-              <w:t>GENDARMERIE NATIONALE</w:t>
+              <w:t>GEOIDE CRYPTO &amp; COM</w:t>
             </w:r>
           </w:p>
         </w:tc>
@@ -2859,19 +2997,39 @@
           <w:tcPr>
             <w:tcW w:w="2713" w:type="dxa"/>
           </w:tcPr>
-          <w:p/>
+          <w:p>
+            <w:r>
+              <w:t>18 rue Alain Savary 25000 Besançon</w:t>
+            </w:r>
+          </w:p>
+          <w:p>
+            <w:r>
+              <w:t xml:space="preserve">Email : </w:t>
+            </w:r>
+            <w:r>
+              <w:t>contact@geoide.fr</w:t>
+            </w:r>
+          </w:p>
         </w:tc>
         <w:tc>
           <w:tcPr>
             <w:tcW w:w="3813" w:type="dxa"/>
           </w:tcPr>
-          <w:p/>
+          <w:p>
+            <w:r>
+              <w:t>https://public.geoide.fr/index.html</w:t>
+            </w:r>
+          </w:p>
         </w:tc>
         <w:tc>
           <w:tcPr>
             <w:tcW w:w="928" w:type="dxa"/>
           </w:tcPr>
-          <w:p/>
+          <w:p>
+            <w:r>
+              <w:t>Envoyé</w:t>
+            </w:r>
+          </w:p>
         </w:tc>
       </w:tr>
       <w:tr>
@@ -2881,7 +3039,13 @@
           </w:tcPr>
           <w:p>
             <w:r>
-              <w:t>GEOIDE CRYPTO &amp; COM</w:t>
+              <w:t>GIE</w:t>
+            </w:r>
+            <w:r>
+              <w:t xml:space="preserve"> </w:t>
+            </w:r>
+            <w:r>
+              <w:t>Mutualité Française Comtoise</w:t>
             </w:r>
           </w:p>
         </w:tc>
@@ -2889,19 +3053,39 @@
           <w:tcPr>
             <w:tcW w:w="2713" w:type="dxa"/>
           </w:tcPr>
-          <w:p/>
+          <w:p>
+            <w:r>
+              <w:t>67 RUE DES CRAS, 25000 BESANCON</w:t>
+            </w:r>
+          </w:p>
+          <w:p>
+            <w:r>
+              <w:t>Tel : 0</w:t>
+            </w:r>
+            <w:r>
+              <w:t>3 81 65 82 65</w:t>
+            </w:r>
+          </w:p>
         </w:tc>
         <w:tc>
           <w:tcPr>
             <w:tcW w:w="3813" w:type="dxa"/>
           </w:tcPr>
-          <w:p/>
+          <w:p>
+            <w:r>
+              <w:t>https://mutcomtoise.fr/</w:t>
+            </w:r>
+          </w:p>
         </w:tc>
         <w:tc>
           <w:tcPr>
             <w:tcW w:w="928" w:type="dxa"/>
           </w:tcPr>
-          <w:p/>
+          <w:p>
+            <w:r>
+              <w:t>Envoyé</w:t>
+            </w:r>
+          </w:p>
         </w:tc>
       </w:tr>
       <w:tr>
@@ -2911,7 +3095,7 @@
           </w:tcPr>
           <w:p>
             <w:r>
-              <w:t>GIE – Mutualité Française Comtoise</w:t>
+              <w:t>Grand Besançon</w:t>
             </w:r>
           </w:p>
         </w:tc>
@@ -2919,13 +3103,47 @@
           <w:tcPr>
             <w:tcW w:w="2713" w:type="dxa"/>
           </w:tcPr>
-          <w:p/>
+          <w:p>
+            <w:r>
+              <w:t>4 rue Plançon</w:t>
+            </w:r>
+            <w:r>
+              <w:br/>
+              <w:t>250</w:t>
+            </w:r>
+            <w:r>
+              <w:t>00</w:t>
+            </w:r>
+            <w:r>
+              <w:t xml:space="preserve"> Besançon</w:t>
+            </w:r>
+          </w:p>
+          <w:p>
+            <w:r>
+              <w:t xml:space="preserve">Tel : </w:t>
+            </w:r>
+            <w:r>
+              <w:t>03.81.87.88.89</w:t>
+            </w:r>
+          </w:p>
+          <w:p>
+            <w:r>
+              <w:t xml:space="preserve">Email : </w:t>
+            </w:r>
+            <w:r>
+              <w:t>contact.gbm@grandbesancon.fr</w:t>
+            </w:r>
+          </w:p>
         </w:tc>
         <w:tc>
           <w:tcPr>
             <w:tcW w:w="3813" w:type="dxa"/>
           </w:tcPr>
-          <w:p/>
+          <w:p>
+            <w:r>
+              <w:t>https://www.grandbesancon.fr/</w:t>
+            </w:r>
+          </w:p>
         </w:tc>
         <w:tc>
           <w:tcPr>
@@ -2941,7 +3159,7 @@
           </w:tcPr>
           <w:p>
             <w:r>
-              <w:t>Grand Besançon</w:t>
+              <w:t>GRUPO ANTOLIN BESANCON</w:t>
             </w:r>
           </w:p>
         </w:tc>
@@ -2949,7 +3167,19 @@
           <w:tcPr>
             <w:tcW w:w="2713" w:type="dxa"/>
           </w:tcPr>
-          <w:p/>
+          <w:p>
+            <w:r>
+              <w:t>8 Rue Gérard Mantion, 25000 Besançon</w:t>
+            </w:r>
+          </w:p>
+          <w:p>
+            <w:r>
+              <w:t xml:space="preserve">Tel : </w:t>
+            </w:r>
+            <w:r>
+              <w:t>03 81 47 77 00</w:t>
+            </w:r>
+          </w:p>
         </w:tc>
         <w:tc>
           <w:tcPr>
@@ -2971,7 +3201,7 @@
           </w:tcPr>
           <w:p>
             <w:r>
-              <w:t>GRUPO ANTOLIN BESANCON</w:t>
+              <w:t>Habitat 25</w:t>
             </w:r>
           </w:p>
         </w:tc>
@@ -2979,19 +3209,66 @@
           <w:tcPr>
             <w:tcW w:w="2713" w:type="dxa"/>
           </w:tcPr>
-          <w:p/>
+          <w:p>
+            <w:r>
+              <w:t>5 rue Loucheur, 250</w:t>
+            </w:r>
+            <w:r>
+              <w:t>00</w:t>
+            </w:r>
+            <w:r>
+              <w:t xml:space="preserve"> Besançon</w:t>
+            </w:r>
+          </w:p>
+          <w:p>
+            <w:pPr>
+              <w:rPr>
+                <w:b/>
+                <w:bCs/>
+              </w:rPr>
+            </w:pPr>
+            <w:r>
+              <w:t xml:space="preserve">Tel : </w:t>
+            </w:r>
+            <w:r>
+              <w:t>03 81 82</w:t>
+            </w:r>
+            <w:r>
+              <w:rPr>
+                <w:rStyle w:val="Lienhypertexte"/>
+              </w:rPr>
+              <w:t xml:space="preserve"> </w:t>
+            </w:r>
+            <w:r>
+              <w:t>78</w:t>
+            </w:r>
+            <w:r>
+              <w:t xml:space="preserve"> </w:t>
+            </w:r>
+            <w:r>
+              <w:t>27</w:t>
+            </w:r>
+          </w:p>
         </w:tc>
         <w:tc>
           <w:tcPr>
             <w:tcW w:w="3813" w:type="dxa"/>
           </w:tcPr>
-          <w:p/>
+          <w:p>
+            <w:r>
+              <w:t>https://habitat25.fr/</w:t>
+            </w:r>
+          </w:p>
         </w:tc>
         <w:tc>
           <w:tcPr>
             <w:tcW w:w="928" w:type="dxa"/>
           </w:tcPr>
-          <w:p/>
+          <w:p>
+            <w:r>
+              <w:t>Envoyé</w:t>
+            </w:r>
+          </w:p>
         </w:tc>
       </w:tr>
       <w:tr>
@@ -2999,11 +3276,7 @@
           <w:tcPr>
             <w:tcW w:w="1402" w:type="dxa"/>
           </w:tcPr>
-          <w:p>
-            <w:r>
-              <w:t>Habitat 25</w:t>
-            </w:r>
-          </w:p>
+          <w:p/>
         </w:tc>
         <w:tc>
           <w:tcPr>
@@ -3029,11 +3302,215 @@
           <w:tcPr>
             <w:tcW w:w="1402" w:type="dxa"/>
           </w:tcPr>
-          <w:p>
-            <w:r>
-              <w:t>HIPTEST</w:t>
-            </w:r>
-          </w:p>
+          <w:p/>
+        </w:tc>
+        <w:tc>
+          <w:tcPr>
+            <w:tcW w:w="2713" w:type="dxa"/>
+          </w:tcPr>
+          <w:p/>
+        </w:tc>
+        <w:tc>
+          <w:tcPr>
+            <w:tcW w:w="3813" w:type="dxa"/>
+          </w:tcPr>
+          <w:p/>
+        </w:tc>
+        <w:tc>
+          <w:tcPr>
+            <w:tcW w:w="928" w:type="dxa"/>
+          </w:tcPr>
+          <w:p/>
+        </w:tc>
+      </w:tr>
+      <w:tr>
+        <w:tc>
+          <w:tcPr>
+            <w:tcW w:w="1402" w:type="dxa"/>
+          </w:tcPr>
+          <w:p/>
+        </w:tc>
+        <w:tc>
+          <w:tcPr>
+            <w:tcW w:w="2713" w:type="dxa"/>
+          </w:tcPr>
+          <w:p/>
+        </w:tc>
+        <w:tc>
+          <w:tcPr>
+            <w:tcW w:w="3813" w:type="dxa"/>
+          </w:tcPr>
+          <w:p/>
+        </w:tc>
+        <w:tc>
+          <w:tcPr>
+            <w:tcW w:w="928" w:type="dxa"/>
+          </w:tcPr>
+          <w:p/>
+        </w:tc>
+      </w:tr>
+      <w:tr>
+        <w:tc>
+          <w:tcPr>
+            <w:tcW w:w="1402" w:type="dxa"/>
+          </w:tcPr>
+          <w:p/>
+        </w:tc>
+        <w:tc>
+          <w:tcPr>
+            <w:tcW w:w="2713" w:type="dxa"/>
+          </w:tcPr>
+          <w:p/>
+        </w:tc>
+        <w:tc>
+          <w:tcPr>
+            <w:tcW w:w="3813" w:type="dxa"/>
+          </w:tcPr>
+          <w:p/>
+        </w:tc>
+        <w:tc>
+          <w:tcPr>
+            <w:tcW w:w="928" w:type="dxa"/>
+          </w:tcPr>
+          <w:p/>
+        </w:tc>
+      </w:tr>
+      <w:tr>
+        <w:tc>
+          <w:tcPr>
+            <w:tcW w:w="1402" w:type="dxa"/>
+          </w:tcPr>
+          <w:p/>
+        </w:tc>
+        <w:tc>
+          <w:tcPr>
+            <w:tcW w:w="2713" w:type="dxa"/>
+          </w:tcPr>
+          <w:p/>
+        </w:tc>
+        <w:tc>
+          <w:tcPr>
+            <w:tcW w:w="3813" w:type="dxa"/>
+          </w:tcPr>
+          <w:p/>
+        </w:tc>
+        <w:tc>
+          <w:tcPr>
+            <w:tcW w:w="928" w:type="dxa"/>
+          </w:tcPr>
+          <w:p/>
+        </w:tc>
+      </w:tr>
+      <w:tr>
+        <w:tc>
+          <w:tcPr>
+            <w:tcW w:w="1402" w:type="dxa"/>
+          </w:tcPr>
+          <w:p/>
+        </w:tc>
+        <w:tc>
+          <w:tcPr>
+            <w:tcW w:w="2713" w:type="dxa"/>
+          </w:tcPr>
+          <w:p/>
+        </w:tc>
+        <w:tc>
+          <w:tcPr>
+            <w:tcW w:w="3813" w:type="dxa"/>
+          </w:tcPr>
+          <w:p/>
+        </w:tc>
+        <w:tc>
+          <w:tcPr>
+            <w:tcW w:w="928" w:type="dxa"/>
+          </w:tcPr>
+          <w:p/>
+        </w:tc>
+      </w:tr>
+      <w:tr>
+        <w:tc>
+          <w:tcPr>
+            <w:tcW w:w="1402" w:type="dxa"/>
+          </w:tcPr>
+          <w:p/>
+        </w:tc>
+        <w:tc>
+          <w:tcPr>
+            <w:tcW w:w="2713" w:type="dxa"/>
+          </w:tcPr>
+          <w:p/>
+        </w:tc>
+        <w:tc>
+          <w:tcPr>
+            <w:tcW w:w="3813" w:type="dxa"/>
+          </w:tcPr>
+          <w:p/>
+        </w:tc>
+        <w:tc>
+          <w:tcPr>
+            <w:tcW w:w="928" w:type="dxa"/>
+          </w:tcPr>
+          <w:p/>
+        </w:tc>
+      </w:tr>
+      <w:tr>
+        <w:tc>
+          <w:tcPr>
+            <w:tcW w:w="1402" w:type="dxa"/>
+          </w:tcPr>
+          <w:p/>
+        </w:tc>
+        <w:tc>
+          <w:tcPr>
+            <w:tcW w:w="2713" w:type="dxa"/>
+          </w:tcPr>
+          <w:p/>
+        </w:tc>
+        <w:tc>
+          <w:tcPr>
+            <w:tcW w:w="3813" w:type="dxa"/>
+          </w:tcPr>
+          <w:p/>
+        </w:tc>
+        <w:tc>
+          <w:tcPr>
+            <w:tcW w:w="928" w:type="dxa"/>
+          </w:tcPr>
+          <w:p/>
+        </w:tc>
+      </w:tr>
+      <w:tr>
+        <w:tc>
+          <w:tcPr>
+            <w:tcW w:w="1402" w:type="dxa"/>
+          </w:tcPr>
+          <w:p/>
+        </w:tc>
+        <w:tc>
+          <w:tcPr>
+            <w:tcW w:w="2713" w:type="dxa"/>
+          </w:tcPr>
+          <w:p/>
+        </w:tc>
+        <w:tc>
+          <w:tcPr>
+            <w:tcW w:w="3813" w:type="dxa"/>
+          </w:tcPr>
+          <w:p/>
+        </w:tc>
+        <w:tc>
+          <w:tcPr>
+            <w:tcW w:w="928" w:type="dxa"/>
+          </w:tcPr>
+          <w:p/>
+        </w:tc>
+      </w:tr>
+      <w:tr>
+        <w:tc>
+          <w:tcPr>
+            <w:tcW w:w="1402" w:type="dxa"/>
+          </w:tcPr>
+          <w:p/>
         </w:tc>
         <w:tc>
           <w:tcPr>
@@ -3109,7 +3586,7 @@
     <w:lvl w:ilvl="0">
       <w:start w:val="1"/>
       <w:numFmt w:val="decimal"/>
-      <w:pStyle w:val="ListNumber3"/>
+      <w:pStyle w:val="Listenumros3"/>
       <w:lvlText w:val="%1."/>
       <w:lvlJc w:val="left"/>
       <w:pPr>
@@ -3127,7 +3604,7 @@
     <w:lvl w:ilvl="0">
       <w:start w:val="1"/>
       <w:numFmt w:val="decimal"/>
-      <w:pStyle w:val="ListNumber2"/>
+      <w:pStyle w:val="Listenumros2"/>
       <w:lvlText w:val="%1."/>
       <w:lvlJc w:val="left"/>
       <w:pPr>
@@ -3165,7 +3642,7 @@
     <w:lvl w:ilvl="0">
       <w:start w:val="1"/>
       <w:numFmt w:val="bullet"/>
-      <w:pStyle w:val="ListBullet3"/>
+      <w:pStyle w:val="Listepuces3"/>
       <w:lvlText w:val=""/>
       <w:lvlJc w:val="left"/>
       <w:pPr>
@@ -3186,7 +3663,7 @@
     <w:lvl w:ilvl="0">
       <w:start w:val="1"/>
       <w:numFmt w:val="bullet"/>
-      <w:pStyle w:val="ListBullet2"/>
+      <w:pStyle w:val="Listepuces2"/>
       <w:lvlText w:val=""/>
       <w:lvlJc w:val="left"/>
       <w:pPr>
@@ -3207,7 +3684,7 @@
     <w:lvl w:ilvl="0">
       <w:start w:val="1"/>
       <w:numFmt w:val="decimal"/>
-      <w:pStyle w:val="ListNumber"/>
+      <w:pStyle w:val="Listenumros"/>
       <w:lvlText w:val="%1."/>
       <w:lvlJc w:val="left"/>
       <w:pPr>
@@ -3225,7 +3702,7 @@
     <w:lvl w:ilvl="0">
       <w:start w:val="1"/>
       <w:numFmt w:val="bullet"/>
-      <w:pStyle w:val="ListBullet"/>
+      <w:pStyle w:val="Listepuces"/>
       <w:lvlText w:val=""/>
       <w:lvlJc w:val="left"/>
       <w:pPr>
@@ -3815,11 +4292,11 @@
       <w:lang w:val="fr-FR"/>
     </w:rPr>
   </w:style>
-  <w:style w:type="paragraph" w:styleId="Heading1">
+  <w:style w:type="paragraph" w:styleId="Titre1">
     <w:name w:val="heading 1"/>
     <w:basedOn w:val="Normal"/>
     <w:next w:val="Normal"/>
-    <w:link w:val="Heading1Char"/>
+    <w:link w:val="Titre1Car"/>
     <w:uiPriority w:val="9"/>
     <w:qFormat/>
     <w:rsid w:val="00FC693F"/>
@@ -3838,11 +4315,11 @@
       <w:szCs w:val="28"/>
     </w:rPr>
   </w:style>
-  <w:style w:type="paragraph" w:styleId="Heading2">
+  <w:style w:type="paragraph" w:styleId="Titre2">
     <w:name w:val="heading 2"/>
     <w:basedOn w:val="Normal"/>
     <w:next w:val="Normal"/>
-    <w:link w:val="Heading2Char"/>
+    <w:link w:val="Titre2Car"/>
     <w:uiPriority w:val="9"/>
     <w:unhideWhenUsed/>
     <w:qFormat/>
@@ -3862,11 +4339,11 @@
       <w:szCs w:val="26"/>
     </w:rPr>
   </w:style>
-  <w:style w:type="paragraph" w:styleId="Heading3">
+  <w:style w:type="paragraph" w:styleId="Titre3">
     <w:name w:val="heading 3"/>
     <w:basedOn w:val="Normal"/>
     <w:next w:val="Normal"/>
-    <w:link w:val="Heading3Char"/>
+    <w:link w:val="Titre3Car"/>
     <w:uiPriority w:val="9"/>
     <w:unhideWhenUsed/>
     <w:qFormat/>
@@ -3884,11 +4361,11 @@
       <w:color w:val="4F81BD" w:themeColor="accent1"/>
     </w:rPr>
   </w:style>
-  <w:style w:type="paragraph" w:styleId="Heading4">
+  <w:style w:type="paragraph" w:styleId="Titre4">
     <w:name w:val="heading 4"/>
     <w:basedOn w:val="Normal"/>
     <w:next w:val="Normal"/>
-    <w:link w:val="Heading4Char"/>
+    <w:link w:val="Titre4Car"/>
     <w:uiPriority w:val="9"/>
     <w:semiHidden/>
     <w:unhideWhenUsed/>
@@ -3909,11 +4386,11 @@
       <w:color w:val="4F81BD" w:themeColor="accent1"/>
     </w:rPr>
   </w:style>
-  <w:style w:type="paragraph" w:styleId="Heading5">
+  <w:style w:type="paragraph" w:styleId="Titre5">
     <w:name w:val="heading 5"/>
     <w:basedOn w:val="Normal"/>
     <w:next w:val="Normal"/>
-    <w:link w:val="Heading5Char"/>
+    <w:link w:val="Titre5Car"/>
     <w:uiPriority w:val="9"/>
     <w:semiHidden/>
     <w:unhideWhenUsed/>
@@ -3930,11 +4407,11 @@
       <w:color w:val="243F60" w:themeColor="accent1" w:themeShade="7F"/>
     </w:rPr>
   </w:style>
-  <w:style w:type="paragraph" w:styleId="Heading6">
+  <w:style w:type="paragraph" w:styleId="Titre6">
     <w:name w:val="heading 6"/>
     <w:basedOn w:val="Normal"/>
     <w:next w:val="Normal"/>
-    <w:link w:val="Heading6Char"/>
+    <w:link w:val="Titre6Car"/>
     <w:uiPriority w:val="9"/>
     <w:semiHidden/>
     <w:unhideWhenUsed/>
@@ -3953,11 +4430,11 @@
       <w:color w:val="243F60" w:themeColor="accent1" w:themeShade="7F"/>
     </w:rPr>
   </w:style>
-  <w:style w:type="paragraph" w:styleId="Heading7">
+  <w:style w:type="paragraph" w:styleId="Titre7">
     <w:name w:val="heading 7"/>
     <w:basedOn w:val="Normal"/>
     <w:next w:val="Normal"/>
-    <w:link w:val="Heading7Char"/>
+    <w:link w:val="Titre7Car"/>
     <w:uiPriority w:val="9"/>
     <w:semiHidden/>
     <w:unhideWhenUsed/>
@@ -3976,11 +4453,11 @@
       <w:color w:val="404040" w:themeColor="text1" w:themeTint="BF"/>
     </w:rPr>
   </w:style>
-  <w:style w:type="paragraph" w:styleId="Heading8">
+  <w:style w:type="paragraph" w:styleId="Titre8">
     <w:name w:val="heading 8"/>
     <w:basedOn w:val="Normal"/>
     <w:next w:val="Normal"/>
-    <w:link w:val="Heading8Char"/>
+    <w:link w:val="Titre8Car"/>
     <w:uiPriority w:val="9"/>
     <w:semiHidden/>
     <w:unhideWhenUsed/>
@@ -3999,11 +4476,11 @@
       <w:szCs w:val="20"/>
     </w:rPr>
   </w:style>
-  <w:style w:type="paragraph" w:styleId="Heading9">
+  <w:style w:type="paragraph" w:styleId="Titre9">
     <w:name w:val="heading 9"/>
     <w:basedOn w:val="Normal"/>
     <w:next w:val="Normal"/>
-    <w:link w:val="Heading9Char"/>
+    <w:link w:val="Titre9Car"/>
     <w:uiPriority w:val="9"/>
     <w:semiHidden/>
     <w:unhideWhenUsed/>
@@ -4024,12 +4501,12 @@
       <w:szCs w:val="20"/>
     </w:rPr>
   </w:style>
-  <w:style w:type="character" w:default="1" w:styleId="DefaultParagraphFont">
+  <w:style w:type="character" w:default="1" w:styleId="Policepardfaut">
     <w:name w:val="Default Paragraph Font"/>
     <w:uiPriority w:val="1"/>
     <w:unhideWhenUsed/>
   </w:style>
-  <w:style w:type="table" w:default="1" w:styleId="TableNormal">
+  <w:style w:type="table" w:default="1" w:styleId="TableauNormal">
     <w:name w:val="Normal Table"/>
     <w:uiPriority w:val="99"/>
     <w:semiHidden/>
@@ -4044,16 +4521,16 @@
       </w:tblCellMar>
     </w:tblPr>
   </w:style>
-  <w:style w:type="numbering" w:default="1" w:styleId="NoList">
+  <w:style w:type="numbering" w:default="1" w:styleId="Aucuneliste">
     <w:name w:val="No List"/>
     <w:uiPriority w:val="99"/>
     <w:semiHidden/>
     <w:unhideWhenUsed/>
   </w:style>
-  <w:style w:type="paragraph" w:styleId="Header">
+  <w:style w:type="paragraph" w:styleId="En-tte">
     <w:name w:val="header"/>
     <w:basedOn w:val="Normal"/>
-    <w:link w:val="HeaderChar"/>
+    <w:link w:val="En-tteCar"/>
     <w:uiPriority w:val="99"/>
     <w:unhideWhenUsed/>
     <w:rsid w:val="00E618BF"/>
@@ -4065,17 +4542,17 @@
       <w:spacing w:after="0" w:line="240" w:lineRule="auto"/>
     </w:pPr>
   </w:style>
-  <w:style w:type="character" w:customStyle="1" w:styleId="HeaderChar">
-    <w:name w:val="Header Char"/>
-    <w:basedOn w:val="DefaultParagraphFont"/>
-    <w:link w:val="Header"/>
+  <w:style w:type="character" w:customStyle="1" w:styleId="En-tteCar">
+    <w:name w:val="En-tête Car"/>
+    <w:basedOn w:val="Policepardfaut"/>
+    <w:link w:val="En-tte"/>
     <w:uiPriority w:val="99"/>
     <w:rsid w:val="00E618BF"/>
   </w:style>
-  <w:style w:type="paragraph" w:styleId="Footer">
+  <w:style w:type="paragraph" w:styleId="Pieddepage">
     <w:name w:val="footer"/>
     <w:basedOn w:val="Normal"/>
-    <w:link w:val="FooterChar"/>
+    <w:link w:val="PieddepageCar"/>
     <w:uiPriority w:val="99"/>
     <w:unhideWhenUsed/>
     <w:rsid w:val="00E618BF"/>
@@ -4087,14 +4564,14 @@
       <w:spacing w:after="0" w:line="240" w:lineRule="auto"/>
     </w:pPr>
   </w:style>
-  <w:style w:type="character" w:customStyle="1" w:styleId="FooterChar">
-    <w:name w:val="Footer Char"/>
-    <w:basedOn w:val="DefaultParagraphFont"/>
-    <w:link w:val="Footer"/>
+  <w:style w:type="character" w:customStyle="1" w:styleId="PieddepageCar">
+    <w:name w:val="Pied de page Car"/>
+    <w:basedOn w:val="Policepardfaut"/>
+    <w:link w:val="Pieddepage"/>
     <w:uiPriority w:val="99"/>
     <w:rsid w:val="00E618BF"/>
   </w:style>
-  <w:style w:type="paragraph" w:styleId="NoSpacing">
+  <w:style w:type="paragraph" w:styleId="Sansinterligne">
     <w:name w:val="No Spacing"/>
     <w:uiPriority w:val="1"/>
     <w:qFormat/>
@@ -4103,10 +4580,10 @@
       <w:spacing w:after="0" w:line="240" w:lineRule="auto"/>
     </w:pPr>
   </w:style>
-  <w:style w:type="character" w:customStyle="1" w:styleId="Heading1Char">
-    <w:name w:val="Heading 1 Char"/>
-    <w:basedOn w:val="DefaultParagraphFont"/>
-    <w:link w:val="Heading1"/>
+  <w:style w:type="character" w:customStyle="1" w:styleId="Titre1Car">
+    <w:name w:val="Titre 1 Car"/>
+    <w:basedOn w:val="Policepardfaut"/>
+    <w:link w:val="Titre1"/>
     <w:uiPriority w:val="9"/>
     <w:rsid w:val="00FC693F"/>
     <w:rPr>
@@ -4118,10 +4595,10 @@
       <w:szCs w:val="28"/>
     </w:rPr>
   </w:style>
-  <w:style w:type="character" w:customStyle="1" w:styleId="Heading2Char">
-    <w:name w:val="Heading 2 Char"/>
-    <w:basedOn w:val="DefaultParagraphFont"/>
-    <w:link w:val="Heading2"/>
+  <w:style w:type="character" w:customStyle="1" w:styleId="Titre2Car">
+    <w:name w:val="Titre 2 Car"/>
+    <w:basedOn w:val="Policepardfaut"/>
+    <w:link w:val="Titre2"/>
     <w:uiPriority w:val="9"/>
     <w:rsid w:val="00FC693F"/>
     <w:rPr>
@@ -4133,10 +4610,10 @@
       <w:szCs w:val="26"/>
     </w:rPr>
   </w:style>
-  <w:style w:type="character" w:customStyle="1" w:styleId="Heading3Char">
-    <w:name w:val="Heading 3 Char"/>
-    <w:basedOn w:val="DefaultParagraphFont"/>
-    <w:link w:val="Heading3"/>
+  <w:style w:type="character" w:customStyle="1" w:styleId="Titre3Car">
+    <w:name w:val="Titre 3 Car"/>
+    <w:basedOn w:val="Policepardfaut"/>
+    <w:link w:val="Titre3"/>
     <w:uiPriority w:val="9"/>
     <w:rsid w:val="00FC693F"/>
     <w:rPr>
@@ -4146,11 +4623,11 @@
       <w:color w:val="4F81BD" w:themeColor="accent1"/>
     </w:rPr>
   </w:style>
-  <w:style w:type="paragraph" w:styleId="Title">
+  <w:style w:type="paragraph" w:styleId="Titre">
     <w:name w:val="Title"/>
     <w:basedOn w:val="Normal"/>
     <w:next w:val="Normal"/>
-    <w:link w:val="TitleChar"/>
+    <w:link w:val="TitreCar"/>
     <w:uiPriority w:val="10"/>
     <w:qFormat/>
     <w:rsid w:val="00FC693F"/>
@@ -4170,10 +4647,10 @@
       <w:szCs w:val="52"/>
     </w:rPr>
   </w:style>
-  <w:style w:type="character" w:customStyle="1" w:styleId="TitleChar">
-    <w:name w:val="Title Char"/>
-    <w:basedOn w:val="DefaultParagraphFont"/>
-    <w:link w:val="Title"/>
+  <w:style w:type="character" w:customStyle="1" w:styleId="TitreCar">
+    <w:name w:val="Titre Car"/>
+    <w:basedOn w:val="Policepardfaut"/>
+    <w:link w:val="Titre"/>
     <w:uiPriority w:val="10"/>
     <w:rsid w:val="00FC693F"/>
     <w:rPr>
@@ -4185,11 +4662,11 @@
       <w:szCs w:val="52"/>
     </w:rPr>
   </w:style>
-  <w:style w:type="paragraph" w:styleId="Subtitle">
+  <w:style w:type="paragraph" w:styleId="Sous-titre">
     <w:name w:val="Subtitle"/>
     <w:basedOn w:val="Normal"/>
     <w:next w:val="Normal"/>
-    <w:link w:val="SubtitleChar"/>
+    <w:link w:val="Sous-titreCar"/>
     <w:uiPriority w:val="11"/>
     <w:qFormat/>
     <w:rsid w:val="00FC693F"/>
@@ -4208,10 +4685,10 @@
       <w:szCs w:val="24"/>
     </w:rPr>
   </w:style>
-  <w:style w:type="character" w:customStyle="1" w:styleId="SubtitleChar">
-    <w:name w:val="Subtitle Char"/>
-    <w:basedOn w:val="DefaultParagraphFont"/>
-    <w:link w:val="Subtitle"/>
+  <w:style w:type="character" w:customStyle="1" w:styleId="Sous-titreCar">
+    <w:name w:val="Sous-titre Car"/>
+    <w:basedOn w:val="Policepardfaut"/>
+    <w:link w:val="Sous-titre"/>
     <w:uiPriority w:val="11"/>
     <w:rsid w:val="00FC693F"/>
     <w:rPr>
@@ -4224,7 +4701,7 @@
       <w:szCs w:val="24"/>
     </w:rPr>
   </w:style>
-  <w:style w:type="paragraph" w:styleId="ListParagraph">
+  <w:style w:type="paragraph" w:styleId="Paragraphedeliste">
     <w:name w:val="List Paragraph"/>
     <w:basedOn w:val="Normal"/>
     <w:uiPriority w:val="34"/>
@@ -4235,10 +4712,10 @@
       <w:contextualSpacing/>
     </w:pPr>
   </w:style>
-  <w:style w:type="paragraph" w:styleId="BodyText">
+  <w:style w:type="paragraph" w:styleId="Corpsdetexte">
     <w:name w:val="Body Text"/>
     <w:basedOn w:val="Normal"/>
-    <w:link w:val="BodyTextChar"/>
+    <w:link w:val="CorpsdetexteCar"/>
     <w:uiPriority w:val="99"/>
     <w:unhideWhenUsed/>
     <w:rsid w:val="00AA1D8D"/>
@@ -4246,17 +4723,17 @@
       <w:spacing w:after="120"/>
     </w:pPr>
   </w:style>
-  <w:style w:type="character" w:customStyle="1" w:styleId="BodyTextChar">
-    <w:name w:val="Body Text Char"/>
-    <w:basedOn w:val="DefaultParagraphFont"/>
-    <w:link w:val="BodyText"/>
+  <w:style w:type="character" w:customStyle="1" w:styleId="CorpsdetexteCar">
+    <w:name w:val="Corps de texte Car"/>
+    <w:basedOn w:val="Policepardfaut"/>
+    <w:link w:val="Corpsdetexte"/>
     <w:uiPriority w:val="99"/>
     <w:rsid w:val="00AA1D8D"/>
   </w:style>
-  <w:style w:type="paragraph" w:styleId="BodyText2">
+  <w:style w:type="paragraph" w:styleId="Corpsdetexte2">
     <w:name w:val="Body Text 2"/>
     <w:basedOn w:val="Normal"/>
-    <w:link w:val="BodyText2Char"/>
+    <w:link w:val="Corpsdetexte2Car"/>
     <w:uiPriority w:val="99"/>
     <w:unhideWhenUsed/>
     <w:rsid w:val="00AA1D8D"/>
@@ -4264,17 +4741,17 @@
       <w:spacing w:after="120" w:line="480" w:lineRule="auto"/>
     </w:pPr>
   </w:style>
-  <w:style w:type="character" w:customStyle="1" w:styleId="BodyText2Char">
-    <w:name w:val="Body Text 2 Char"/>
-    <w:basedOn w:val="DefaultParagraphFont"/>
-    <w:link w:val="BodyText2"/>
+  <w:style w:type="character" w:customStyle="1" w:styleId="Corpsdetexte2Car">
+    <w:name w:val="Corps de texte 2 Car"/>
+    <w:basedOn w:val="Policepardfaut"/>
+    <w:link w:val="Corpsdetexte2"/>
     <w:uiPriority w:val="99"/>
     <w:rsid w:val="00AA1D8D"/>
   </w:style>
-  <w:style w:type="paragraph" w:styleId="BodyText3">
+  <w:style w:type="paragraph" w:styleId="Corpsdetexte3">
     <w:name w:val="Body Text 3"/>
     <w:basedOn w:val="Normal"/>
-    <w:link w:val="BodyText3Char"/>
+    <w:link w:val="Corpsdetexte3Car"/>
     <w:uiPriority w:val="99"/>
     <w:unhideWhenUsed/>
     <w:rsid w:val="00AA1D8D"/>
@@ -4286,10 +4763,10 @@
       <w:szCs w:val="16"/>
     </w:rPr>
   </w:style>
-  <w:style w:type="character" w:customStyle="1" w:styleId="BodyText3Char">
-    <w:name w:val="Body Text 3 Char"/>
-    <w:basedOn w:val="DefaultParagraphFont"/>
-    <w:link w:val="BodyText3"/>
+  <w:style w:type="character" w:customStyle="1" w:styleId="Corpsdetexte3Car">
+    <w:name w:val="Corps de texte 3 Car"/>
+    <w:basedOn w:val="Policepardfaut"/>
+    <w:link w:val="Corpsdetexte3"/>
     <w:uiPriority w:val="99"/>
     <w:rsid w:val="00AA1D8D"/>
     <w:rPr>
@@ -4297,7 +4774,7 @@
       <w:szCs w:val="16"/>
     </w:rPr>
   </w:style>
-  <w:style w:type="paragraph" w:styleId="List">
+  <w:style w:type="paragraph" w:styleId="Liste">
     <w:name w:val="List"/>
     <w:basedOn w:val="Normal"/>
     <w:uiPriority w:val="99"/>
@@ -4308,7 +4785,7 @@
       <w:contextualSpacing/>
     </w:pPr>
   </w:style>
-  <w:style w:type="paragraph" w:styleId="List2">
+  <w:style w:type="paragraph" w:styleId="Liste2">
     <w:name w:val="List 2"/>
     <w:basedOn w:val="Normal"/>
     <w:uiPriority w:val="99"/>
@@ -4319,7 +4796,7 @@
       <w:contextualSpacing/>
     </w:pPr>
   </w:style>
-  <w:style w:type="paragraph" w:styleId="List3">
+  <w:style w:type="paragraph" w:styleId="Liste3">
     <w:name w:val="List 3"/>
     <w:basedOn w:val="Normal"/>
     <w:uiPriority w:val="99"/>
@@ -4330,7 +4807,7 @@
       <w:contextualSpacing/>
     </w:pPr>
   </w:style>
-  <w:style w:type="paragraph" w:styleId="ListBullet">
+  <w:style w:type="paragraph" w:styleId="Listepuces">
     <w:name w:val="List Bullet"/>
     <w:basedOn w:val="Normal"/>
     <w:uiPriority w:val="99"/>
@@ -4343,7 +4820,7 @@
       <w:contextualSpacing/>
     </w:pPr>
   </w:style>
-  <w:style w:type="paragraph" w:styleId="ListBullet2">
+  <w:style w:type="paragraph" w:styleId="Listepuces2">
     <w:name w:val="List Bullet 2"/>
     <w:basedOn w:val="Normal"/>
     <w:uiPriority w:val="99"/>
@@ -4356,7 +4833,7 @@
       <w:contextualSpacing/>
     </w:pPr>
   </w:style>
-  <w:style w:type="paragraph" w:styleId="ListBullet3">
+  <w:style w:type="paragraph" w:styleId="Listepuces3">
     <w:name w:val="List Bullet 3"/>
     <w:basedOn w:val="Normal"/>
     <w:uiPriority w:val="99"/>
@@ -4369,7 +4846,7 @@
       <w:contextualSpacing/>
     </w:pPr>
   </w:style>
-  <w:style w:type="paragraph" w:styleId="ListNumber">
+  <w:style w:type="paragraph" w:styleId="Listenumros">
     <w:name w:val="List Number"/>
     <w:basedOn w:val="Normal"/>
     <w:uiPriority w:val="99"/>
@@ -4382,7 +4859,7 @@
       <w:contextualSpacing/>
     </w:pPr>
   </w:style>
-  <w:style w:type="paragraph" w:styleId="ListNumber2">
+  <w:style w:type="paragraph" w:styleId="Listenumros2">
     <w:name w:val="List Number 2"/>
     <w:basedOn w:val="Normal"/>
     <w:uiPriority w:val="99"/>
@@ -4395,7 +4872,7 @@
       <w:contextualSpacing/>
     </w:pPr>
   </w:style>
-  <w:style w:type="paragraph" w:styleId="ListNumber3">
+  <w:style w:type="paragraph" w:styleId="Listenumros3">
     <w:name w:val="List Number 3"/>
     <w:basedOn w:val="Normal"/>
     <w:uiPriority w:val="99"/>
@@ -4408,7 +4885,7 @@
       <w:contextualSpacing/>
     </w:pPr>
   </w:style>
-  <w:style w:type="paragraph" w:styleId="ListContinue">
+  <w:style w:type="paragraph" w:styleId="Listecontinue">
     <w:name w:val="List Continue"/>
     <w:basedOn w:val="Normal"/>
     <w:uiPriority w:val="99"/>
@@ -4420,7 +4897,7 @@
       <w:contextualSpacing/>
     </w:pPr>
   </w:style>
-  <w:style w:type="paragraph" w:styleId="ListContinue2">
+  <w:style w:type="paragraph" w:styleId="Listecontinue2">
     <w:name w:val="List Continue 2"/>
     <w:basedOn w:val="Normal"/>
     <w:uiPriority w:val="99"/>
@@ -4432,7 +4909,7 @@
       <w:contextualSpacing/>
     </w:pPr>
   </w:style>
-  <w:style w:type="paragraph" w:styleId="ListContinue3">
+  <w:style w:type="paragraph" w:styleId="Listecontinue3">
     <w:name w:val="List Continue 3"/>
     <w:basedOn w:val="Normal"/>
     <w:uiPriority w:val="99"/>
@@ -4444,9 +4921,9 @@
       <w:contextualSpacing/>
     </w:pPr>
   </w:style>
-  <w:style w:type="paragraph" w:styleId="MacroText">
+  <w:style w:type="paragraph" w:styleId="Textedemacro">
     <w:name w:val="macro"/>
-    <w:link w:val="MacroTextChar"/>
+    <w:link w:val="TextedemacroCar"/>
     <w:uiPriority w:val="99"/>
     <w:unhideWhenUsed/>
     <w:rsid w:val="0029639D"/>
@@ -4467,10 +4944,10 @@
       <w:szCs w:val="20"/>
     </w:rPr>
   </w:style>
-  <w:style w:type="character" w:customStyle="1" w:styleId="MacroTextChar">
-    <w:name w:val="Macro Text Char"/>
-    <w:basedOn w:val="DefaultParagraphFont"/>
-    <w:link w:val="MacroText"/>
+  <w:style w:type="character" w:customStyle="1" w:styleId="TextedemacroCar">
+    <w:name w:val="Texte de macro Car"/>
+    <w:basedOn w:val="Policepardfaut"/>
+    <w:link w:val="Textedemacro"/>
     <w:uiPriority w:val="99"/>
     <w:rsid w:val="0029639D"/>
     <w:rPr>
@@ -4479,11 +4956,11 @@
       <w:szCs w:val="20"/>
     </w:rPr>
   </w:style>
-  <w:style w:type="paragraph" w:styleId="Quote">
+  <w:style w:type="paragraph" w:styleId="Citation">
     <w:name w:val="Quote"/>
     <w:basedOn w:val="Normal"/>
     <w:next w:val="Normal"/>
-    <w:link w:val="QuoteChar"/>
+    <w:link w:val="CitationCar"/>
     <w:uiPriority w:val="29"/>
     <w:qFormat/>
     <w:rsid w:val="00FC693F"/>
@@ -4493,10 +4970,10 @@
       <w:color w:val="000000" w:themeColor="text1"/>
     </w:rPr>
   </w:style>
-  <w:style w:type="character" w:customStyle="1" w:styleId="QuoteChar">
-    <w:name w:val="Quote Char"/>
-    <w:basedOn w:val="DefaultParagraphFont"/>
-    <w:link w:val="Quote"/>
+  <w:style w:type="character" w:customStyle="1" w:styleId="CitationCar">
+    <w:name w:val="Citation Car"/>
+    <w:basedOn w:val="Policepardfaut"/>
+    <w:link w:val="Citation"/>
     <w:uiPriority w:val="29"/>
     <w:rsid w:val="00FC693F"/>
     <w:rPr>
@@ -4505,10 +4982,10 @@
       <w:color w:val="000000" w:themeColor="text1"/>
     </w:rPr>
   </w:style>
-  <w:style w:type="character" w:customStyle="1" w:styleId="Heading4Char">
-    <w:name w:val="Heading 4 Char"/>
-    <w:basedOn w:val="DefaultParagraphFont"/>
-    <w:link w:val="Heading4"/>
+  <w:style w:type="character" w:customStyle="1" w:styleId="Titre4Car">
+    <w:name w:val="Titre 4 Car"/>
+    <w:basedOn w:val="Policepardfaut"/>
+    <w:link w:val="Titre4"/>
     <w:uiPriority w:val="9"/>
     <w:semiHidden/>
     <w:rsid w:val="00FC693F"/>
@@ -4521,10 +4998,10 @@
       <w:color w:val="4F81BD" w:themeColor="accent1"/>
     </w:rPr>
   </w:style>
-  <w:style w:type="character" w:customStyle="1" w:styleId="Heading5Char">
-    <w:name w:val="Heading 5 Char"/>
-    <w:basedOn w:val="DefaultParagraphFont"/>
-    <w:link w:val="Heading5"/>
+  <w:style w:type="character" w:customStyle="1" w:styleId="Titre5Car">
+    <w:name w:val="Titre 5 Car"/>
+    <w:basedOn w:val="Policepardfaut"/>
+    <w:link w:val="Titre5"/>
     <w:uiPriority w:val="9"/>
     <w:semiHidden/>
     <w:rsid w:val="00FC693F"/>
@@ -4533,10 +5010,10 @@
       <w:color w:val="243F60" w:themeColor="accent1" w:themeShade="7F"/>
     </w:rPr>
   </w:style>
-  <w:style w:type="character" w:customStyle="1" w:styleId="Heading6Char">
-    <w:name w:val="Heading 6 Char"/>
-    <w:basedOn w:val="DefaultParagraphFont"/>
-    <w:link w:val="Heading6"/>
+  <w:style w:type="character" w:customStyle="1" w:styleId="Titre6Car">
+    <w:name w:val="Titre 6 Car"/>
+    <w:basedOn w:val="Policepardfaut"/>
+    <w:link w:val="Titre6"/>
     <w:uiPriority w:val="9"/>
     <w:semiHidden/>
     <w:rsid w:val="00FC693F"/>
@@ -4547,10 +5024,10 @@
       <w:color w:val="243F60" w:themeColor="accent1" w:themeShade="7F"/>
     </w:rPr>
   </w:style>
-  <w:style w:type="character" w:customStyle="1" w:styleId="Heading7Char">
-    <w:name w:val="Heading 7 Char"/>
-    <w:basedOn w:val="DefaultParagraphFont"/>
-    <w:link w:val="Heading7"/>
+  <w:style w:type="character" w:customStyle="1" w:styleId="Titre7Car">
+    <w:name w:val="Titre 7 Car"/>
+    <w:basedOn w:val="Policepardfaut"/>
+    <w:link w:val="Titre7"/>
     <w:uiPriority w:val="9"/>
     <w:semiHidden/>
     <w:rsid w:val="00FC693F"/>
@@ -4561,10 +5038,10 @@
       <w:color w:val="404040" w:themeColor="text1" w:themeTint="BF"/>
     </w:rPr>
   </w:style>
-  <w:style w:type="character" w:customStyle="1" w:styleId="Heading8Char">
-    <w:name w:val="Heading 8 Char"/>
-    <w:basedOn w:val="DefaultParagraphFont"/>
-    <w:link w:val="Heading8"/>
+  <w:style w:type="character" w:customStyle="1" w:styleId="Titre8Car">
+    <w:name w:val="Titre 8 Car"/>
+    <w:basedOn w:val="Policepardfaut"/>
+    <w:link w:val="Titre8"/>
     <w:uiPriority w:val="9"/>
     <w:semiHidden/>
     <w:rsid w:val="00FC693F"/>
@@ -4575,10 +5052,10 @@
       <w:szCs w:val="20"/>
     </w:rPr>
   </w:style>
-  <w:style w:type="character" w:customStyle="1" w:styleId="Heading9Char">
-    <w:name w:val="Heading 9 Char"/>
-    <w:basedOn w:val="DefaultParagraphFont"/>
-    <w:link w:val="Heading9"/>
+  <w:style w:type="character" w:customStyle="1" w:styleId="Titre9Car">
+    <w:name w:val="Titre 9 Car"/>
+    <w:basedOn w:val="Policepardfaut"/>
+    <w:link w:val="Titre9"/>
     <w:uiPriority w:val="9"/>
     <w:semiHidden/>
     <w:rsid w:val="00FC693F"/>
@@ -4591,7 +5068,7 @@
       <w:szCs w:val="20"/>
     </w:rPr>
   </w:style>
-  <w:style w:type="paragraph" w:styleId="Caption">
+  <w:style w:type="paragraph" w:styleId="Lgende">
     <w:name w:val="caption"/>
     <w:basedOn w:val="Normal"/>
     <w:next w:val="Normal"/>
@@ -4611,9 +5088,9 @@
       <w:szCs w:val="18"/>
     </w:rPr>
   </w:style>
-  <w:style w:type="character" w:styleId="Strong">
+  <w:style w:type="character" w:styleId="lev">
     <w:name w:val="Strong"/>
-    <w:basedOn w:val="DefaultParagraphFont"/>
+    <w:basedOn w:val="Policepardfaut"/>
     <w:uiPriority w:val="22"/>
     <w:qFormat/>
     <w:rsid w:val="00FC693F"/>
@@ -4622,9 +5099,9 @@
       <w:bCs/>
     </w:rPr>
   </w:style>
-  <w:style w:type="character" w:styleId="Emphasis">
+  <w:style w:type="character" w:styleId="Accentuation">
     <w:name w:val="Emphasis"/>
-    <w:basedOn w:val="DefaultParagraphFont"/>
+    <w:basedOn w:val="Policepardfaut"/>
     <w:uiPriority w:val="20"/>
     <w:qFormat/>
     <w:rsid w:val="00FC693F"/>
@@ -4633,11 +5110,11 @@
       <w:iCs/>
     </w:rPr>
   </w:style>
-  <w:style w:type="paragraph" w:styleId="IntenseQuote">
+  <w:style w:type="paragraph" w:styleId="Citationintense">
     <w:name w:val="Intense Quote"/>
     <w:basedOn w:val="Normal"/>
     <w:next w:val="Normal"/>
-    <w:link w:val="IntenseQuoteChar"/>
+    <w:link w:val="CitationintenseCar"/>
     <w:uiPriority w:val="30"/>
     <w:qFormat/>
     <w:rsid w:val="00FC693F"/>
@@ -4656,10 +5133,10 @@
       <w:color w:val="4F81BD" w:themeColor="accent1"/>
     </w:rPr>
   </w:style>
-  <w:style w:type="character" w:customStyle="1" w:styleId="IntenseQuoteChar">
-    <w:name w:val="Intense Quote Char"/>
-    <w:basedOn w:val="DefaultParagraphFont"/>
-    <w:link w:val="IntenseQuote"/>
+  <w:style w:type="character" w:customStyle="1" w:styleId="CitationintenseCar">
+    <w:name w:val="Citation intense Car"/>
+    <w:basedOn w:val="Policepardfaut"/>
+    <w:link w:val="Citationintense"/>
     <w:uiPriority w:val="30"/>
     <w:rsid w:val="00FC693F"/>
     <w:rPr>
@@ -4670,9 +5147,9 @@
       <w:color w:val="4F81BD" w:themeColor="accent1"/>
     </w:rPr>
   </w:style>
-  <w:style w:type="character" w:styleId="SubtleEmphasis">
+  <w:style w:type="character" w:styleId="Accentuationlgre">
     <w:name w:val="Subtle Emphasis"/>
-    <w:basedOn w:val="DefaultParagraphFont"/>
+    <w:basedOn w:val="Policepardfaut"/>
     <w:uiPriority w:val="19"/>
     <w:qFormat/>
     <w:rsid w:val="00FC693F"/>
@@ -4682,9 +5159,9 @@
       <w:color w:val="808080" w:themeColor="text1" w:themeTint="7F"/>
     </w:rPr>
   </w:style>
-  <w:style w:type="character" w:styleId="IntenseEmphasis">
+  <w:style w:type="character" w:styleId="Accentuationintense">
     <w:name w:val="Intense Emphasis"/>
-    <w:basedOn w:val="DefaultParagraphFont"/>
+    <w:basedOn w:val="Policepardfaut"/>
     <w:uiPriority w:val="21"/>
     <w:qFormat/>
     <w:rsid w:val="00FC693F"/>
@@ -4696,9 +5173,9 @@
       <w:color w:val="4F81BD" w:themeColor="accent1"/>
     </w:rPr>
   </w:style>
-  <w:style w:type="character" w:styleId="SubtleReference">
+  <w:style w:type="character" w:styleId="Rfrencelgre">
     <w:name w:val="Subtle Reference"/>
-    <w:basedOn w:val="DefaultParagraphFont"/>
+    <w:basedOn w:val="Policepardfaut"/>
     <w:uiPriority w:val="31"/>
     <w:qFormat/>
     <w:rsid w:val="00FC693F"/>
@@ -4708,9 +5185,9 @@
       <w:u w:val="single"/>
     </w:rPr>
   </w:style>
-  <w:style w:type="character" w:styleId="IntenseReference">
+  <w:style w:type="character" w:styleId="Rfrenceintense">
     <w:name w:val="Intense Reference"/>
-    <w:basedOn w:val="DefaultParagraphFont"/>
+    <w:basedOn w:val="Policepardfaut"/>
     <w:uiPriority w:val="32"/>
     <w:qFormat/>
     <w:rsid w:val="00FC693F"/>
@@ -4723,9 +5200,9 @@
       <w:u w:val="single"/>
     </w:rPr>
   </w:style>
-  <w:style w:type="character" w:styleId="BookTitle">
+  <w:style w:type="character" w:styleId="Titredulivre">
     <w:name w:val="Book Title"/>
-    <w:basedOn w:val="DefaultParagraphFont"/>
+    <w:basedOn w:val="Policepardfaut"/>
     <w:uiPriority w:val="33"/>
     <w:qFormat/>
     <w:rsid w:val="00FC693F"/>
@@ -4736,9 +5213,9 @@
       <w:spacing w:val="5"/>
     </w:rPr>
   </w:style>
-  <w:style w:type="paragraph" w:styleId="TOCHeading">
+  <w:style w:type="paragraph" w:styleId="En-ttedetabledesmatires">
     <w:name w:val="TOC Heading"/>
-    <w:basedOn w:val="Heading1"/>
+    <w:basedOn w:val="Titre1"/>
     <w:next w:val="Normal"/>
     <w:uiPriority w:val="39"/>
     <w:semiHidden/>
@@ -4749,9 +5226,9 @@
       <w:outlineLvl w:val="9"/>
     </w:pPr>
   </w:style>
-  <w:style w:type="table" w:styleId="TableGrid">
+  <w:style w:type="table" w:styleId="Grilledutableau">
     <w:name w:val="Table Grid"/>
-    <w:basedOn w:val="TableNormal"/>
+    <w:basedOn w:val="TableauNormal"/>
     <w:uiPriority w:val="59"/>
     <w:rsid w:val="00FC693F"/>
     <w:pPr>
@@ -4768,9 +5245,9 @@
       </w:tblBorders>
     </w:tblPr>
   </w:style>
-  <w:style w:type="table" w:styleId="LightShading">
+  <w:style w:type="table" w:styleId="Ombrageclair">
     <w:name w:val="Light Shading"/>
-    <w:basedOn w:val="TableNormal"/>
+    <w:basedOn w:val="TableauNormal"/>
     <w:uiPriority w:val="60"/>
     <w:rsid w:val="00FC693F"/>
     <w:pPr>
@@ -4864,9 +5341,9 @@
       </w:tcPr>
     </w:tblStylePr>
   </w:style>
-  <w:style w:type="table" w:styleId="LightShading-Accent1">
+  <w:style w:type="table" w:styleId="Trameclaire-Accent1">
     <w:name w:val="Light Shading Accent 1"/>
-    <w:basedOn w:val="TableNormal"/>
+    <w:basedOn w:val="TableauNormal"/>
     <w:uiPriority w:val="60"/>
     <w:rsid w:val="00FC693F"/>
     <w:pPr>
@@ -4960,9 +5437,9 @@
       </w:tcPr>
     </w:tblStylePr>
   </w:style>
-  <w:style w:type="table" w:styleId="LightShading-Accent2">
+  <w:style w:type="table" w:styleId="Trameclaire-Accent2">
     <w:name w:val="Light Shading Accent 2"/>
-    <w:basedOn w:val="TableNormal"/>
+    <w:basedOn w:val="TableauNormal"/>
     <w:uiPriority w:val="60"/>
     <w:rsid w:val="00FC693F"/>
     <w:pPr>
@@ -5056,9 +5533,9 @@
       </w:tcPr>
     </w:tblStylePr>
   </w:style>
-  <w:style w:type="table" w:styleId="LightShading-Accent3">
+  <w:style w:type="table" w:styleId="Trameclaire-Accent3">
     <w:name w:val="Light Shading Accent 3"/>
-    <w:basedOn w:val="TableNormal"/>
+    <w:basedOn w:val="TableauNormal"/>
     <w:uiPriority w:val="60"/>
     <w:rsid w:val="00FC693F"/>
     <w:pPr>
@@ -5152,9 +5629,9 @@
       </w:tcPr>
     </w:tblStylePr>
   </w:style>
-  <w:style w:type="table" w:styleId="LightShading-Accent4">
+  <w:style w:type="table" w:styleId="Trameclaire-Accent4">
     <w:name w:val="Light Shading Accent 4"/>
-    <w:basedOn w:val="TableNormal"/>
+    <w:basedOn w:val="TableauNormal"/>
     <w:uiPriority w:val="60"/>
     <w:rsid w:val="00FC693F"/>
     <w:pPr>
@@ -5248,9 +5725,9 @@
       </w:tcPr>
     </w:tblStylePr>
   </w:style>
-  <w:style w:type="table" w:styleId="LightShading-Accent5">
+  <w:style w:type="table" w:styleId="Trameclaire-Accent5">
     <w:name w:val="Light Shading Accent 5"/>
-    <w:basedOn w:val="TableNormal"/>
+    <w:basedOn w:val="TableauNormal"/>
     <w:uiPriority w:val="60"/>
     <w:rsid w:val="00FC693F"/>
     <w:pPr>
@@ -5344,9 +5821,9 @@
       </w:tcPr>
     </w:tblStylePr>
   </w:style>
-  <w:style w:type="table" w:styleId="LightShading-Accent6">
+  <w:style w:type="table" w:styleId="Trameclaire-Accent6">
     <w:name w:val="Light Shading Accent 6"/>
-    <w:basedOn w:val="TableNormal"/>
+    <w:basedOn w:val="TableauNormal"/>
     <w:uiPriority w:val="60"/>
     <w:rsid w:val="00FC693F"/>
     <w:pPr>
@@ -5440,9 +5917,9 @@
       </w:tcPr>
     </w:tblStylePr>
   </w:style>
-  <w:style w:type="table" w:styleId="LightList">
+  <w:style w:type="table" w:styleId="Listeclaire">
     <w:name w:val="Light List"/>
-    <w:basedOn w:val="TableNormal"/>
+    <w:basedOn w:val="TableauNormal"/>
     <w:uiPriority w:val="61"/>
     <w:rsid w:val="00FC693F"/>
     <w:pPr>
@@ -5525,9 +6002,9 @@
       </w:tcPr>
     </w:tblStylePr>
   </w:style>
-  <w:style w:type="table" w:styleId="LightList-Accent1">
+  <w:style w:type="table" w:styleId="Listeclaire-Accent1">
     <w:name w:val="Light List Accent 1"/>
-    <w:basedOn w:val="TableNormal"/>
+    <w:basedOn w:val="TableauNormal"/>
     <w:uiPriority w:val="61"/>
     <w:rsid w:val="00FC693F"/>
     <w:pPr>
@@ -5610,9 +6087,9 @@
       </w:tcPr>
     </w:tblStylePr>
   </w:style>
-  <w:style w:type="table" w:styleId="LightList-Accent2">
+  <w:style w:type="table" w:styleId="Listeclaire-Accent2">
     <w:name w:val="Light List Accent 2"/>
-    <w:basedOn w:val="TableNormal"/>
+    <w:basedOn w:val="TableauNormal"/>
     <w:uiPriority w:val="61"/>
     <w:rsid w:val="00CB0664"/>
     <w:pPr>
@@ -5695,9 +6172,9 @@
       </w:tcPr>
     </w:tblStylePr>
   </w:style>
-  <w:style w:type="table" w:styleId="LightList-Accent3">
+  <w:style w:type="table" w:styleId="Listeclaire-Accent3">
     <w:name w:val="Light List Accent 3"/>
-    <w:basedOn w:val="TableNormal"/>
+    <w:basedOn w:val="TableauNormal"/>
     <w:uiPriority w:val="61"/>
     <w:rsid w:val="00CB0664"/>
     <w:pPr>
@@ -5780,9 +6257,9 @@
       </w:tcPr>
     </w:tblStylePr>
   </w:style>
-  <w:style w:type="table" w:styleId="LightList-Accent4">
+  <w:style w:type="table" w:styleId="Listeclaire-Accent4">
     <w:name w:val="Light List Accent 4"/>
-    <w:basedOn w:val="TableNormal"/>
+    <w:basedOn w:val="TableauNormal"/>
     <w:uiPriority w:val="61"/>
     <w:rsid w:val="00CB0664"/>
     <w:pPr>
@@ -5865,9 +6342,9 @@
       </w:tcPr>
     </w:tblStylePr>
   </w:style>
-  <w:style w:type="table" w:styleId="LightList-Accent5">
+  <w:style w:type="table" w:styleId="Listeclaire-Accent5">
     <w:name w:val="Light List Accent 5"/>
-    <w:basedOn w:val="TableNormal"/>
+    <w:basedOn w:val="TableauNormal"/>
     <w:uiPriority w:val="61"/>
     <w:rsid w:val="00CB0664"/>
     <w:pPr>
@@ -5950,9 +6427,9 @@
       </w:tcPr>
     </w:tblStylePr>
   </w:style>
-  <w:style w:type="table" w:styleId="LightList-Accent6">
+  <w:style w:type="table" w:styleId="Listeclaire-Accent6">
     <w:name w:val="Light List Accent 6"/>
-    <w:basedOn w:val="TableNormal"/>
+    <w:basedOn w:val="TableauNormal"/>
     <w:uiPriority w:val="61"/>
     <w:rsid w:val="00CB0664"/>
     <w:pPr>
@@ -6035,9 +6512,9 @@
       </w:tcPr>
     </w:tblStylePr>
   </w:style>
-  <w:style w:type="table" w:styleId="LightGrid">
+  <w:style w:type="table" w:styleId="Grilleclaire">
     <w:name w:val="Light Grid"/>
-    <w:basedOn w:val="TableNormal"/>
+    <w:basedOn w:val="TableauNormal"/>
     <w:uiPriority w:val="62"/>
     <w:rsid w:val="00CB0664"/>
     <w:pPr>
@@ -6158,9 +6635,9 @@
       </w:tcPr>
     </w:tblStylePr>
   </w:style>
-  <w:style w:type="table" w:styleId="LightGrid-Accent1">
+  <w:style w:type="table" w:styleId="Grilleclaire-Accent1">
     <w:name w:val="Light Grid Accent 1"/>
-    <w:basedOn w:val="TableNormal"/>
+    <w:basedOn w:val="TableauNormal"/>
     <w:uiPriority w:val="62"/>
     <w:rsid w:val="00CB0664"/>
     <w:pPr>
@@ -6281,9 +6758,9 @@
       </w:tcPr>
     </w:tblStylePr>
   </w:style>
-  <w:style w:type="table" w:styleId="LightGrid-Accent2">
+  <w:style w:type="table" w:styleId="Grilleclaire-Accent2">
     <w:name w:val="Light Grid Accent 2"/>
-    <w:basedOn w:val="TableNormal"/>
+    <w:basedOn w:val="TableauNormal"/>
     <w:uiPriority w:val="62"/>
     <w:rsid w:val="00CB0664"/>
     <w:pPr>
@@ -6404,9 +6881,9 @@
       </w:tcPr>
     </w:tblStylePr>
   </w:style>
-  <w:style w:type="table" w:styleId="LightGrid-Accent3">
+  <w:style w:type="table" w:styleId="Grilleclaire-Accent3">
     <w:name w:val="Light Grid Accent 3"/>
-    <w:basedOn w:val="TableNormal"/>
+    <w:basedOn w:val="TableauNormal"/>
     <w:uiPriority w:val="62"/>
     <w:rsid w:val="00CB0664"/>
     <w:pPr>
@@ -6527,9 +7004,9 @@
       </w:tcPr>
     </w:tblStylePr>
   </w:style>
-  <w:style w:type="table" w:styleId="LightGrid-Accent4">
+  <w:style w:type="table" w:styleId="Grilleclaire-Accent4">
     <w:name w:val="Light Grid Accent 4"/>
-    <w:basedOn w:val="TableNormal"/>
+    <w:basedOn w:val="TableauNormal"/>
     <w:uiPriority w:val="62"/>
     <w:rsid w:val="00CB0664"/>
     <w:pPr>
@@ -6650,9 +7127,9 @@
       </w:tcPr>
     </w:tblStylePr>
   </w:style>
-  <w:style w:type="table" w:styleId="LightGrid-Accent5">
+  <w:style w:type="table" w:styleId="Grilleclaire-Accent5">
     <w:name w:val="Light Grid Accent 5"/>
-    <w:basedOn w:val="TableNormal"/>
+    <w:basedOn w:val="TableauNormal"/>
     <w:uiPriority w:val="62"/>
     <w:rsid w:val="00CB0664"/>
     <w:pPr>
@@ -6773,9 +7250,9 @@
       </w:tcPr>
     </w:tblStylePr>
   </w:style>
-  <w:style w:type="table" w:styleId="LightGrid-Accent6">
+  <w:style w:type="table" w:styleId="Grilleclaire-Accent6">
     <w:name w:val="Light Grid Accent 6"/>
-    <w:basedOn w:val="TableNormal"/>
+    <w:basedOn w:val="TableauNormal"/>
     <w:uiPriority w:val="62"/>
     <w:rsid w:val="00CB0664"/>
     <w:pPr>
@@ -6896,9 +7373,9 @@
       </w:tcPr>
     </w:tblStylePr>
   </w:style>
-  <w:style w:type="table" w:styleId="MediumShading1">
+  <w:style w:type="table" w:styleId="Tramemoyenne1">
     <w:name w:val="Medium Shading 1"/>
-    <w:basedOn w:val="TableNormal"/>
+    <w:basedOn w:val="TableauNormal"/>
     <w:uiPriority w:val="63"/>
     <w:rsid w:val="00CB0664"/>
     <w:pPr>
@@ -6995,9 +7472,9 @@
       </w:tcPr>
     </w:tblStylePr>
   </w:style>
-  <w:style w:type="table" w:styleId="MediumShading1-Accent1">
+  <w:style w:type="table" w:styleId="Tramemoyenne1-Accent1">
     <w:name w:val="Medium Shading 1 Accent 1"/>
-    <w:basedOn w:val="TableNormal"/>
+    <w:basedOn w:val="TableauNormal"/>
     <w:uiPriority w:val="63"/>
     <w:rsid w:val="00CB0664"/>
     <w:pPr>
@@ -7094,9 +7571,9 @@
       </w:tcPr>
     </w:tblStylePr>
   </w:style>
-  <w:style w:type="table" w:styleId="MediumShading1-Accent2">
+  <w:style w:type="table" w:styleId="Tramemoyenne1-Accent2">
     <w:name w:val="Medium Shading 1 Accent 2"/>
-    <w:basedOn w:val="TableNormal"/>
+    <w:basedOn w:val="TableauNormal"/>
     <w:uiPriority w:val="63"/>
     <w:rsid w:val="00CB0664"/>
     <w:pPr>
@@ -7193,9 +7670,9 @@
       </w:tcPr>
     </w:tblStylePr>
   </w:style>
-  <w:style w:type="table" w:styleId="MediumShading1-Accent3">
+  <w:style w:type="table" w:styleId="Tramemoyenne1-Accent3">
     <w:name w:val="Medium Shading 1 Accent 3"/>
-    <w:basedOn w:val="TableNormal"/>
+    <w:basedOn w:val="TableauNormal"/>
     <w:uiPriority w:val="63"/>
     <w:rsid w:val="00CB0664"/>
     <w:pPr>
@@ -7292,9 +7769,9 @@
       </w:tcPr>
     </w:tblStylePr>
   </w:style>
-  <w:style w:type="table" w:styleId="MediumShading1-Accent4">
+  <w:style w:type="table" w:styleId="Tramemoyenne1-Accent4">
     <w:name w:val="Medium Shading 1 Accent 4"/>
-    <w:basedOn w:val="TableNormal"/>
+    <w:basedOn w:val="TableauNormal"/>
     <w:uiPriority w:val="63"/>
     <w:rsid w:val="00CB0664"/>
     <w:pPr>
@@ -7391,9 +7868,9 @@
       </w:tcPr>
     </w:tblStylePr>
   </w:style>
-  <w:style w:type="table" w:styleId="MediumShading1-Accent5">
+  <w:style w:type="table" w:styleId="Tramemoyenne1-Accent5">
     <w:name w:val="Medium Shading 1 Accent 5"/>
-    <w:basedOn w:val="TableNormal"/>
+    <w:basedOn w:val="TableauNormal"/>
     <w:uiPriority w:val="63"/>
     <w:rsid w:val="00CB0664"/>
     <w:pPr>
@@ -7490,9 +7967,9 @@
       </w:tcPr>
     </w:tblStylePr>
   </w:style>
-  <w:style w:type="table" w:styleId="MediumShading1-Accent6">
+  <w:style w:type="table" w:styleId="Tramemoyenne1-Accent6">
     <w:name w:val="Medium Shading 1 Accent 6"/>
-    <w:basedOn w:val="TableNormal"/>
+    <w:basedOn w:val="TableauNormal"/>
     <w:uiPriority w:val="63"/>
     <w:rsid w:val="00CB0664"/>
     <w:pPr>
@@ -7589,9 +8066,9 @@
       </w:tcPr>
     </w:tblStylePr>
   </w:style>
-  <w:style w:type="table" w:styleId="MediumShading2">
+  <w:style w:type="table" w:styleId="Tramemoyenne2">
     <w:name w:val="Medium Shading 2"/>
-    <w:basedOn w:val="TableNormal"/>
+    <w:basedOn w:val="TableauNormal"/>
     <w:uiPriority w:val="64"/>
     <w:rsid w:val="00CB0664"/>
     <w:pPr>
@@ -7731,9 +8208,9 @@
       </w:tcPr>
     </w:tblStylePr>
   </w:style>
-  <w:style w:type="table" w:styleId="MediumShading2-Accent1">
+  <w:style w:type="table" w:styleId="Tramemoyenne2-Accent1">
     <w:name w:val="Medium Shading 2 Accent 1"/>
-    <w:basedOn w:val="TableNormal"/>
+    <w:basedOn w:val="TableauNormal"/>
     <w:uiPriority w:val="64"/>
     <w:rsid w:val="00CB0664"/>
     <w:pPr>
@@ -7873,9 +8350,9 @@
       </w:tcPr>
     </w:tblStylePr>
   </w:style>
-  <w:style w:type="table" w:styleId="MediumShading2-Accent2">
+  <w:style w:type="table" w:styleId="Tramemoyenne2-Accent2">
     <w:name w:val="Medium Shading 2 Accent 2"/>
-    <w:basedOn w:val="TableNormal"/>
+    <w:basedOn w:val="TableauNormal"/>
     <w:uiPriority w:val="64"/>
     <w:rsid w:val="00CB0664"/>
     <w:pPr>
@@ -8015,9 +8492,9 @@
       </w:tcPr>
     </w:tblStylePr>
   </w:style>
-  <w:style w:type="table" w:styleId="MediumShading2-Accent3">
+  <w:style w:type="table" w:styleId="Tramemoyenne2-Accent3">
     <w:name w:val="Medium Shading 2 Accent 3"/>
-    <w:basedOn w:val="TableNormal"/>
+    <w:basedOn w:val="TableauNormal"/>
     <w:uiPriority w:val="64"/>
     <w:rsid w:val="00CB0664"/>
     <w:pPr>
@@ -8157,9 +8634,9 @@
       </w:tcPr>
     </w:tblStylePr>
   </w:style>
-  <w:style w:type="table" w:styleId="MediumShading2-Accent4">
+  <w:style w:type="table" w:styleId="Tramemoyenne2-Accent4">
     <w:name w:val="Medium Shading 2 Accent 4"/>
-    <w:basedOn w:val="TableNormal"/>
+    <w:basedOn w:val="TableauNormal"/>
     <w:uiPriority w:val="64"/>
     <w:rsid w:val="00CB0664"/>
     <w:pPr>
@@ -8299,9 +8776,9 @@
       </w:tcPr>
     </w:tblStylePr>
   </w:style>
-  <w:style w:type="table" w:styleId="MediumShading2-Accent5">
+  <w:style w:type="table" w:styleId="Tramemoyenne2-Accent5">
     <w:name w:val="Medium Shading 2 Accent 5"/>
-    <w:basedOn w:val="TableNormal"/>
+    <w:basedOn w:val="TableauNormal"/>
     <w:uiPriority w:val="64"/>
     <w:rsid w:val="00CB0664"/>
     <w:pPr>
@@ -8441,9 +8918,9 @@
       </w:tcPr>
     </w:tblStylePr>
   </w:style>
-  <w:style w:type="table" w:styleId="MediumShading2-Accent6">
+  <w:style w:type="table" w:styleId="Tramemoyenne2-Accent6">
     <w:name w:val="Medium Shading 2 Accent 6"/>
-    <w:basedOn w:val="TableNormal"/>
+    <w:basedOn w:val="TableauNormal"/>
     <w:uiPriority w:val="64"/>
     <w:rsid w:val="00CB0664"/>
     <w:pPr>
@@ -8583,9 +9060,9 @@
       </w:tcPr>
     </w:tblStylePr>
   </w:style>
-  <w:style w:type="table" w:styleId="MediumList1">
+  <w:style w:type="table" w:styleId="Listemoyenne1">
     <w:name w:val="Medium List 1"/>
-    <w:basedOn w:val="TableNormal"/>
+    <w:basedOn w:val="TableauNormal"/>
     <w:uiPriority w:val="65"/>
     <w:rsid w:val="00CB0664"/>
     <w:pPr>
@@ -8660,9 +9137,9 @@
       </w:tcPr>
     </w:tblStylePr>
   </w:style>
-  <w:style w:type="table" w:styleId="MediumList1-Accent1">
+  <w:style w:type="table" w:styleId="Listemoyenne1-Accent1">
     <w:name w:val="Medium List 1 Accent 1"/>
-    <w:basedOn w:val="TableNormal"/>
+    <w:basedOn w:val="TableauNormal"/>
     <w:uiPriority w:val="65"/>
     <w:rsid w:val="00CB0664"/>
     <w:pPr>
@@ -8737,9 +9214,9 @@
       </w:tcPr>
     </w:tblStylePr>
   </w:style>
-  <w:style w:type="table" w:styleId="MediumList1-Accent2">
+  <w:style w:type="table" w:styleId="Listemoyenne1-Accent2">
     <w:name w:val="Medium List 1 Accent 2"/>
-    <w:basedOn w:val="TableNormal"/>
+    <w:basedOn w:val="TableauNormal"/>
     <w:uiPriority w:val="65"/>
     <w:rsid w:val="00CB0664"/>
     <w:pPr>
@@ -8814,9 +9291,9 @@
       </w:tcPr>
     </w:tblStylePr>
   </w:style>
-  <w:style w:type="table" w:styleId="MediumList1-Accent3">
+  <w:style w:type="table" w:styleId="Listemoyenne1-Accent3">
     <w:name w:val="Medium List 1 Accent 3"/>
-    <w:basedOn w:val="TableNormal"/>
+    <w:basedOn w:val="TableauNormal"/>
     <w:uiPriority w:val="65"/>
     <w:rsid w:val="00CB0664"/>
     <w:pPr>
@@ -8891,9 +9368,9 @@
       </w:tcPr>
     </w:tblStylePr>
   </w:style>
-  <w:style w:type="table" w:styleId="MediumList1-Accent4">
+  <w:style w:type="table" w:styleId="Listemoyenne1-Accent4">
     <w:name w:val="Medium List 1 Accent 4"/>
-    <w:basedOn w:val="TableNormal"/>
+    <w:basedOn w:val="TableauNormal"/>
     <w:uiPriority w:val="65"/>
     <w:rsid w:val="00CB0664"/>
     <w:pPr>
@@ -8968,9 +9445,9 @@
       </w:tcPr>
     </w:tblStylePr>
   </w:style>
-  <w:style w:type="table" w:styleId="MediumList1-Accent5">
+  <w:style w:type="table" w:styleId="Listemoyenne1-Accent5">
     <w:name w:val="Medium List 1 Accent 5"/>
-    <w:basedOn w:val="TableNormal"/>
+    <w:basedOn w:val="TableauNormal"/>
     <w:uiPriority w:val="65"/>
     <w:rsid w:val="00CB0664"/>
     <w:pPr>
@@ -9045,9 +9522,9 @@
       </w:tcPr>
     </w:tblStylePr>
   </w:style>
-  <w:style w:type="table" w:styleId="MediumList1-Accent6">
+  <w:style w:type="table" w:styleId="Listemoyenne1-Accent6">
     <w:name w:val="Medium List 1 Accent 6"/>
-    <w:basedOn w:val="TableNormal"/>
+    <w:basedOn w:val="TableauNormal"/>
     <w:uiPriority w:val="65"/>
     <w:rsid w:val="00CB0664"/>
     <w:pPr>
@@ -9122,9 +9599,9 @@
       </w:tcPr>
     </w:tblStylePr>
   </w:style>
-  <w:style w:type="table" w:styleId="MediumList2">
+  <w:style w:type="table" w:styleId="Listemoyenne2">
     <w:name w:val="Medium List 2"/>
-    <w:basedOn w:val="TableNormal"/>
+    <w:basedOn w:val="TableauNormal"/>
     <w:uiPriority w:val="66"/>
     <w:rsid w:val="00CB0664"/>
     <w:pPr>
@@ -9243,9 +9720,9 @@
       </w:tcPr>
     </w:tblStylePr>
   </w:style>
-  <w:style w:type="table" w:styleId="MediumList2-Accent1">
+  <w:style w:type="table" w:styleId="Listemoyenne2-Accent1">
     <w:name w:val="Medium List 2 Accent 1"/>
-    <w:basedOn w:val="TableNormal"/>
+    <w:basedOn w:val="TableauNormal"/>
     <w:uiPriority w:val="66"/>
     <w:rsid w:val="00CB0664"/>
     <w:pPr>
@@ -9364,9 +9841,9 @@
       </w:tcPr>
     </w:tblStylePr>
   </w:style>
-  <w:style w:type="table" w:styleId="MediumList2-Accent2">
+  <w:style w:type="table" w:styleId="Listemoyenne2-Accent2">
     <w:name w:val="Medium List 2 Accent 2"/>
-    <w:basedOn w:val="TableNormal"/>
+    <w:basedOn w:val="TableauNormal"/>
     <w:uiPriority w:val="66"/>
     <w:rsid w:val="00CB0664"/>
     <w:pPr>
@@ -9485,9 +9962,9 @@
       </w:tcPr>
     </w:tblStylePr>
   </w:style>
-  <w:style w:type="table" w:styleId="MediumList2-Accent3">
+  <w:style w:type="table" w:styleId="Listemoyenne2-Accent3">
     <w:name w:val="Medium List 2 Accent 3"/>
-    <w:basedOn w:val="TableNormal"/>
+    <w:basedOn w:val="TableauNormal"/>
     <w:uiPriority w:val="66"/>
     <w:rsid w:val="00CB0664"/>
     <w:pPr>
@@ -9606,9 +10083,9 @@
       </w:tcPr>
     </w:tblStylePr>
   </w:style>
-  <w:style w:type="table" w:styleId="MediumList2-Accent4">
+  <w:style w:type="table" w:styleId="Listemoyenne2-Accent4">
     <w:name w:val="Medium List 2 Accent 4"/>
-    <w:basedOn w:val="TableNormal"/>
+    <w:basedOn w:val="TableauNormal"/>
     <w:uiPriority w:val="66"/>
     <w:rsid w:val="00CB0664"/>
     <w:pPr>
@@ -9727,9 +10204,9 @@
       </w:tcPr>
     </w:tblStylePr>
   </w:style>
-  <w:style w:type="table" w:styleId="MediumList2-Accent5">
+  <w:style w:type="table" w:styleId="Listemoyenne2-Accent5">
     <w:name w:val="Medium List 2 Accent 5"/>
-    <w:basedOn w:val="TableNormal"/>
+    <w:basedOn w:val="TableauNormal"/>
     <w:uiPriority w:val="66"/>
     <w:rsid w:val="00CB0664"/>
     <w:pPr>
@@ -9848,9 +10325,9 @@
       </w:tcPr>
     </w:tblStylePr>
   </w:style>
-  <w:style w:type="table" w:styleId="MediumList2-Accent6">
+  <w:style w:type="table" w:styleId="Listemoyenne2-Accent6">
     <w:name w:val="Medium List 2 Accent 6"/>
-    <w:basedOn w:val="TableNormal"/>
+    <w:basedOn w:val="TableauNormal"/>
     <w:uiPriority w:val="66"/>
     <w:rsid w:val="00CB0664"/>
     <w:pPr>
@@ -9969,9 +10446,9 @@
       </w:tcPr>
     </w:tblStylePr>
   </w:style>
-  <w:style w:type="table" w:styleId="MediumGrid1">
+  <w:style w:type="table" w:styleId="Grillemoyenne1">
     <w:name w:val="Medium Grid 1"/>
-    <w:basedOn w:val="TableNormal"/>
+    <w:basedOn w:val="TableauNormal"/>
     <w:uiPriority w:val="67"/>
     <w:rsid w:val="00CB0664"/>
     <w:pPr>
@@ -10035,9 +10512,9 @@
       </w:tcPr>
     </w:tblStylePr>
   </w:style>
-  <w:style w:type="table" w:styleId="MediumGrid1-Accent1">
+  <w:style w:type="table" w:styleId="Grillemoyenne1-Accent1">
     <w:name w:val="Medium Grid 1 Accent 1"/>
-    <w:basedOn w:val="TableNormal"/>
+    <w:basedOn w:val="TableauNormal"/>
     <w:uiPriority w:val="67"/>
     <w:rsid w:val="00CB0664"/>
     <w:pPr>
@@ -10101,9 +10578,9 @@
       </w:tcPr>
     </w:tblStylePr>
   </w:style>
-  <w:style w:type="table" w:styleId="MediumGrid1-Accent2">
+  <w:style w:type="table" w:styleId="Grillemoyenne1-Accent2">
     <w:name w:val="Medium Grid 1 Accent 2"/>
-    <w:basedOn w:val="TableNormal"/>
+    <w:basedOn w:val="TableauNormal"/>
     <w:uiPriority w:val="67"/>
     <w:rsid w:val="00CB0664"/>
     <w:pPr>
@@ -10167,9 +10644,9 @@
       </w:tcPr>
     </w:tblStylePr>
   </w:style>
-  <w:style w:type="table" w:styleId="MediumGrid1-Accent3">
+  <w:style w:type="table" w:styleId="Grillemoyenne1-Accent3">
     <w:name w:val="Medium Grid 1 Accent 3"/>
-    <w:basedOn w:val="TableNormal"/>
+    <w:basedOn w:val="TableauNormal"/>
     <w:uiPriority w:val="67"/>
     <w:rsid w:val="00CB0664"/>
     <w:pPr>
@@ -10233,9 +10710,9 @@
       </w:tcPr>
     </w:tblStylePr>
   </w:style>
-  <w:style w:type="table" w:styleId="MediumGrid1-Accent4">
+  <w:style w:type="table" w:styleId="Grillemoyenne1-Accent4">
     <w:name w:val="Medium Grid 1 Accent 4"/>
-    <w:basedOn w:val="TableNormal"/>
+    <w:basedOn w:val="TableauNormal"/>
     <w:uiPriority w:val="67"/>
     <w:rsid w:val="00CB0664"/>
     <w:pPr>
@@ -10299,9 +10776,9 @@
       </w:tcPr>
     </w:tblStylePr>
   </w:style>
-  <w:style w:type="table" w:styleId="MediumGrid1-Accent5">
+  <w:style w:type="table" w:styleId="Grillemoyenne1-Accent5">
     <w:name w:val="Medium Grid 1 Accent 5"/>
-    <w:basedOn w:val="TableNormal"/>
+    <w:basedOn w:val="TableauNormal"/>
     <w:uiPriority w:val="67"/>
     <w:rsid w:val="00CB0664"/>
     <w:pPr>
@@ -10365,9 +10842,9 @@
       </w:tcPr>
     </w:tblStylePr>
   </w:style>
-  <w:style w:type="table" w:styleId="MediumGrid1-Accent6">
+  <w:style w:type="table" w:styleId="Grillemoyenne1-Accent6">
     <w:name w:val="Medium Grid 1 Accent 6"/>
-    <w:basedOn w:val="TableNormal"/>
+    <w:basedOn w:val="TableauNormal"/>
     <w:uiPriority w:val="67"/>
     <w:rsid w:val="00CB0664"/>
     <w:pPr>
@@ -10431,9 +10908,9 @@
       </w:tcPr>
     </w:tblStylePr>
   </w:style>
-  <w:style w:type="table" w:styleId="MediumGrid2">
+  <w:style w:type="table" w:styleId="Grillemoyenne2">
     <w:name w:val="Medium Grid 2"/>
-    <w:basedOn w:val="TableNormal"/>
+    <w:basedOn w:val="TableauNormal"/>
     <w:uiPriority w:val="68"/>
     <w:rsid w:val="00CB0664"/>
     <w:pPr>
@@ -10549,9 +11026,9 @@
       </w:tcPr>
     </w:tblStylePr>
   </w:style>
-  <w:style w:type="table" w:styleId="MediumGrid2-Accent1">
+  <w:style w:type="table" w:styleId="Grillemoyenne2-Accent1">
     <w:name w:val="Medium Grid 2 Accent 1"/>
-    <w:basedOn w:val="TableNormal"/>
+    <w:basedOn w:val="TableauNormal"/>
     <w:uiPriority w:val="68"/>
     <w:rsid w:val="00CB0664"/>
     <w:pPr>
@@ -10667,9 +11144,9 @@
       </w:tcPr>
     </w:tblStylePr>
   </w:style>
-  <w:style w:type="table" w:styleId="MediumGrid2-Accent2">
+  <w:style w:type="table" w:styleId="Grillemoyenne2-Accent2">
     <w:name w:val="Medium Grid 2 Accent 2"/>
-    <w:basedOn w:val="TableNormal"/>
+    <w:basedOn w:val="TableauNormal"/>
     <w:uiPriority w:val="68"/>
     <w:rsid w:val="00CB0664"/>
     <w:pPr>
@@ -10785,9 +11262,9 @@
       </w:tcPr>
     </w:tblStylePr>
   </w:style>
-  <w:style w:type="table" w:styleId="MediumGrid2-Accent3">
+  <w:style w:type="table" w:styleId="Grillemoyenne2-Accent3">
     <w:name w:val="Medium Grid 2 Accent 3"/>
-    <w:basedOn w:val="TableNormal"/>
+    <w:basedOn w:val="TableauNormal"/>
     <w:uiPriority w:val="68"/>
     <w:rsid w:val="00CB0664"/>
     <w:pPr>
@@ -10903,9 +11380,9 @@
       </w:tcPr>
     </w:tblStylePr>
   </w:style>
-  <w:style w:type="table" w:styleId="MediumGrid2-Accent4">
+  <w:style w:type="table" w:styleId="Grillemoyenne2-Accent4">
     <w:name w:val="Medium Grid 2 Accent 4"/>
-    <w:basedOn w:val="TableNormal"/>
+    <w:basedOn w:val="TableauNormal"/>
     <w:uiPriority w:val="68"/>
     <w:rsid w:val="00CB0664"/>
     <w:pPr>
@@ -11021,9 +11498,9 @@
       </w:tcPr>
     </w:tblStylePr>
   </w:style>
-  <w:style w:type="table" w:styleId="MediumGrid2-Accent5">
+  <w:style w:type="table" w:styleId="Grillemoyenne2-Accent5">
     <w:name w:val="Medium Grid 2 Accent 5"/>
-    <w:basedOn w:val="TableNormal"/>
+    <w:basedOn w:val="TableauNormal"/>
     <w:uiPriority w:val="68"/>
     <w:rsid w:val="00CB0664"/>
     <w:pPr>
@@ -11139,9 +11616,9 @@
       </w:tcPr>
     </w:tblStylePr>
   </w:style>
-  <w:style w:type="table" w:styleId="MediumGrid2-Accent6">
+  <w:style w:type="table" w:styleId="Grillemoyenne2-Accent6">
     <w:name w:val="Medium Grid 2 Accent 6"/>
-    <w:basedOn w:val="TableNormal"/>
+    <w:basedOn w:val="TableauNormal"/>
     <w:uiPriority w:val="68"/>
     <w:rsid w:val="00CB0664"/>
     <w:pPr>
@@ -11257,9 +11734,9 @@
       </w:tcPr>
     </w:tblStylePr>
   </w:style>
-  <w:style w:type="table" w:styleId="MediumGrid3">
+  <w:style w:type="table" w:styleId="Grillemoyenne3">
     <w:name w:val="Medium Grid 3"/>
-    <w:basedOn w:val="TableNormal"/>
+    <w:basedOn w:val="TableauNormal"/>
     <w:uiPriority w:val="69"/>
     <w:rsid w:val="00CB0664"/>
     <w:pPr>
@@ -11391,9 +11868,9 @@
       </w:tcPr>
     </w:tblStylePr>
   </w:style>
-  <w:style w:type="table" w:styleId="MediumGrid3-Accent1">
+  <w:style w:type="table" w:styleId="Grillemoyenne3-Accent1">
     <w:name w:val="Medium Grid 3 Accent 1"/>
-    <w:basedOn w:val="TableNormal"/>
+    <w:basedOn w:val="TableauNormal"/>
     <w:uiPriority w:val="69"/>
     <w:rsid w:val="00CB0664"/>
     <w:pPr>
@@ -11525,9 +12002,9 @@
       </w:tcPr>
     </w:tblStylePr>
   </w:style>
-  <w:style w:type="table" w:styleId="MediumGrid3-Accent2">
+  <w:style w:type="table" w:styleId="Grillemoyenne3-Accent2">
     <w:name w:val="Medium Grid 3 Accent 2"/>
-    <w:basedOn w:val="TableNormal"/>
+    <w:basedOn w:val="TableauNormal"/>
     <w:uiPriority w:val="69"/>
     <w:rsid w:val="00CB0664"/>
     <w:pPr>
@@ -11659,9 +12136,9 @@
       </w:tcPr>
     </w:tblStylePr>
   </w:style>
-  <w:style w:type="table" w:styleId="MediumGrid3-Accent3">
+  <w:style w:type="table" w:styleId="Grillemoyenne3-Accent3">
     <w:name w:val="Medium Grid 3 Accent 3"/>
-    <w:basedOn w:val="TableNormal"/>
+    <w:basedOn w:val="TableauNormal"/>
     <w:uiPriority w:val="69"/>
     <w:rsid w:val="00CB0664"/>
     <w:pPr>
@@ -11793,9 +12270,9 @@
       </w:tcPr>
     </w:tblStylePr>
   </w:style>
-  <w:style w:type="table" w:styleId="MediumGrid3-Accent4">
+  <w:style w:type="table" w:styleId="Grillemoyenne3-Accent4">
     <w:name w:val="Medium Grid 3 Accent 4"/>
-    <w:basedOn w:val="TableNormal"/>
+    <w:basedOn w:val="TableauNormal"/>
     <w:uiPriority w:val="69"/>
     <w:rsid w:val="00CB0664"/>
     <w:pPr>
@@ -11927,9 +12404,9 @@
       </w:tcPr>
     </w:tblStylePr>
   </w:style>
-  <w:style w:type="table" w:styleId="MediumGrid3-Accent5">
+  <w:style w:type="table" w:styleId="Grillemoyenne3-Accent5">
     <w:name w:val="Medium Grid 3 Accent 5"/>
-    <w:basedOn w:val="TableNormal"/>
+    <w:basedOn w:val="TableauNormal"/>
     <w:uiPriority w:val="69"/>
     <w:rsid w:val="00CB0664"/>
     <w:pPr>
@@ -12061,9 +12538,9 @@
       </w:tcPr>
     </w:tblStylePr>
   </w:style>
-  <w:style w:type="table" w:styleId="MediumGrid3-Accent6">
+  <w:style w:type="table" w:styleId="Grillemoyenne3-Accent6">
     <w:name w:val="Medium Grid 3 Accent 6"/>
-    <w:basedOn w:val="TableNormal"/>
+    <w:basedOn w:val="TableauNormal"/>
     <w:uiPriority w:val="69"/>
     <w:rsid w:val="00CB0664"/>
     <w:pPr>
@@ -12195,9 +12672,9 @@
       </w:tcPr>
     </w:tblStylePr>
   </w:style>
-  <w:style w:type="table" w:styleId="DarkList">
+  <w:style w:type="table" w:styleId="Listefonce">
     <w:name w:val="Dark List"/>
-    <w:basedOn w:val="TableNormal"/>
+    <w:basedOn w:val="TableauNormal"/>
     <w:uiPriority w:val="70"/>
     <w:rsid w:val="00CB0664"/>
     <w:pPr>
@@ -12302,9 +12779,9 @@
       </w:tcPr>
     </w:tblStylePr>
   </w:style>
-  <w:style w:type="table" w:styleId="DarkList-Accent1">
+  <w:style w:type="table" w:styleId="Listefonce-Accent1">
     <w:name w:val="Dark List Accent 1"/>
-    <w:basedOn w:val="TableNormal"/>
+    <w:basedOn w:val="TableauNormal"/>
     <w:uiPriority w:val="70"/>
     <w:rsid w:val="00CB0664"/>
     <w:pPr>
@@ -12409,9 +12886,9 @@
       </w:tcPr>
     </w:tblStylePr>
   </w:style>
-  <w:style w:type="table" w:styleId="DarkList-Accent2">
+  <w:style w:type="table" w:styleId="Listefonce-Accent2">
     <w:name w:val="Dark List Accent 2"/>
-    <w:basedOn w:val="TableNormal"/>
+    <w:basedOn w:val="TableauNormal"/>
     <w:uiPriority w:val="70"/>
     <w:rsid w:val="00CB0664"/>
     <w:pPr>
@@ -12516,9 +12993,9 @@
       </w:tcPr>
     </w:tblStylePr>
   </w:style>
-  <w:style w:type="table" w:styleId="DarkList-Accent3">
+  <w:style w:type="table" w:styleId="Listefonce-Accent3">
     <w:name w:val="Dark List Accent 3"/>
-    <w:basedOn w:val="TableNormal"/>
+    <w:basedOn w:val="TableauNormal"/>
     <w:uiPriority w:val="70"/>
     <w:rsid w:val="00CB0664"/>
     <w:pPr>
@@ -12623,9 +13100,9 @@
       </w:tcPr>
     </w:tblStylePr>
   </w:style>
-  <w:style w:type="table" w:styleId="DarkList-Accent4">
+  <w:style w:type="table" w:styleId="Listefonce-Accent4">
     <w:name w:val="Dark List Accent 4"/>
-    <w:basedOn w:val="TableNormal"/>
+    <w:basedOn w:val="TableauNormal"/>
     <w:uiPriority w:val="70"/>
     <w:rsid w:val="00CB0664"/>
     <w:pPr>
@@ -12730,9 +13207,9 @@
       </w:tcPr>
     </w:tblStylePr>
   </w:style>
-  <w:style w:type="table" w:styleId="DarkList-Accent5">
+  <w:style w:type="table" w:styleId="Listefonce-Accent5">
     <w:name w:val="Dark List Accent 5"/>
-    <w:basedOn w:val="TableNormal"/>
+    <w:basedOn w:val="TableauNormal"/>
     <w:uiPriority w:val="70"/>
     <w:rsid w:val="00CB0664"/>
     <w:pPr>
@@ -12837,9 +13314,9 @@
       </w:tcPr>
     </w:tblStylePr>
   </w:style>
-  <w:style w:type="table" w:styleId="DarkList-Accent6">
+  <w:style w:type="table" w:styleId="Listefonce-Accent6">
     <w:name w:val="Dark List Accent 6"/>
-    <w:basedOn w:val="TableNormal"/>
+    <w:basedOn w:val="TableauNormal"/>
     <w:uiPriority w:val="70"/>
     <w:rsid w:val="00CB0664"/>
     <w:pPr>
@@ -12944,9 +13421,9 @@
       </w:tcPr>
     </w:tblStylePr>
   </w:style>
-  <w:style w:type="table" w:styleId="ColorfulShading">
+  <w:style w:type="table" w:styleId="Tramecouleur">
     <w:name w:val="Colorful Shading"/>
-    <w:basedOn w:val="TableNormal"/>
+    <w:basedOn w:val="TableauNormal"/>
     <w:uiPriority w:val="71"/>
     <w:rsid w:val="00CB0664"/>
     <w:pPr>
@@ -13059,9 +13536,9 @@
       </w:rPr>
     </w:tblStylePr>
   </w:style>
-  <w:style w:type="table" w:styleId="ColorfulShading-Accent1">
+  <w:style w:type="table" w:styleId="Tramecouleur-Accent1">
     <w:name w:val="Colorful Shading Accent 1"/>
-    <w:basedOn w:val="TableNormal"/>
+    <w:basedOn w:val="TableauNormal"/>
     <w:uiPriority w:val="71"/>
     <w:rsid w:val="00CB0664"/>
     <w:pPr>
@@ -13174,9 +13651,9 @@
       </w:rPr>
     </w:tblStylePr>
   </w:style>
-  <w:style w:type="table" w:styleId="ColorfulShading-Accent2">
+  <w:style w:type="table" w:styleId="Tramecouleur-Accent2">
     <w:name w:val="Colorful Shading Accent 2"/>
-    <w:basedOn w:val="TableNormal"/>
+    <w:basedOn w:val="TableauNormal"/>
     <w:uiPriority w:val="71"/>
     <w:rsid w:val="00CB0664"/>
     <w:pPr>
@@ -13289,9 +13766,9 @@
       </w:rPr>
     </w:tblStylePr>
   </w:style>
-  <w:style w:type="table" w:styleId="ColorfulShading-Accent3">
+  <w:style w:type="table" w:styleId="Tramecouleur-Accent3">
     <w:name w:val="Colorful Shading Accent 3"/>
-    <w:basedOn w:val="TableNormal"/>
+    <w:basedOn w:val="TableauNormal"/>
     <w:uiPriority w:val="71"/>
     <w:rsid w:val="00CB0664"/>
     <w:pPr>
@@ -13394,9 +13871,9 @@
       </w:tcPr>
     </w:tblStylePr>
   </w:style>
-  <w:style w:type="table" w:styleId="ColorfulShading-Accent4">
+  <w:style w:type="table" w:styleId="Tramecouleur-Accent4">
     <w:name w:val="Colorful Shading Accent 4"/>
-    <w:basedOn w:val="TableNormal"/>
+    <w:basedOn w:val="TableauNormal"/>
     <w:uiPriority w:val="71"/>
     <w:rsid w:val="00CB0664"/>
     <w:pPr>
@@ -13509,9 +13986,9 @@
       </w:rPr>
     </w:tblStylePr>
   </w:style>
-  <w:style w:type="table" w:styleId="ColorfulShading-Accent5">
+  <w:style w:type="table" w:styleId="Tramecouleur-Accent5">
     <w:name w:val="Colorful Shading Accent 5"/>
-    <w:basedOn w:val="TableNormal"/>
+    <w:basedOn w:val="TableauNormal"/>
     <w:uiPriority w:val="71"/>
     <w:rsid w:val="00CB0664"/>
     <w:pPr>
@@ -13624,9 +14101,9 @@
       </w:rPr>
     </w:tblStylePr>
   </w:style>
-  <w:style w:type="table" w:styleId="ColorfulShading-Accent6">
+  <w:style w:type="table" w:styleId="Tramecouleur-Accent6">
     <w:name w:val="Colorful Shading Accent 6"/>
-    <w:basedOn w:val="TableNormal"/>
+    <w:basedOn w:val="TableauNormal"/>
     <w:uiPriority w:val="71"/>
     <w:rsid w:val="00CB0664"/>
     <w:pPr>
@@ -13739,9 +14216,9 @@
       </w:rPr>
     </w:tblStylePr>
   </w:style>
-  <w:style w:type="table" w:styleId="ColorfulList">
+  <w:style w:type="table" w:styleId="Listecouleur">
     <w:name w:val="Colorful List"/>
-    <w:basedOn w:val="TableNormal"/>
+    <w:basedOn w:val="TableauNormal"/>
     <w:uiPriority w:val="72"/>
     <w:rsid w:val="00CB0664"/>
     <w:pPr>
@@ -13818,9 +14295,9 @@
       </w:tcPr>
     </w:tblStylePr>
   </w:style>
-  <w:style w:type="table" w:styleId="ColorfulList-Accent1">
+  <w:style w:type="table" w:styleId="Listecouleur-Accent1">
     <w:name w:val="Colorful List Accent 1"/>
-    <w:basedOn w:val="TableNormal"/>
+    <w:basedOn w:val="TableauNormal"/>
     <w:uiPriority w:val="72"/>
     <w:rsid w:val="00CB0664"/>
     <w:pPr>
@@ -13897,9 +14374,9 @@
       </w:tcPr>
     </w:tblStylePr>
   </w:style>
-  <w:style w:type="table" w:styleId="ColorfulList-Accent2">
+  <w:style w:type="table" w:styleId="Listecouleur-Accent2">
     <w:name w:val="Colorful List Accent 2"/>
-    <w:basedOn w:val="TableNormal"/>
+    <w:basedOn w:val="TableauNormal"/>
     <w:uiPriority w:val="72"/>
     <w:rsid w:val="00CB0664"/>
     <w:pPr>
@@ -13976,9 +14453,9 @@
       </w:tcPr>
     </w:tblStylePr>
   </w:style>
-  <w:style w:type="table" w:styleId="ColorfulList-Accent3">
+  <w:style w:type="table" w:styleId="Listecouleur-Accent3">
     <w:name w:val="Colorful List Accent 3"/>
-    <w:basedOn w:val="TableNormal"/>
+    <w:basedOn w:val="TableauNormal"/>
     <w:uiPriority w:val="72"/>
     <w:rsid w:val="00CB0664"/>
     <w:pPr>
@@ -14055,9 +14532,9 @@
       </w:tcPr>
     </w:tblStylePr>
   </w:style>
-  <w:style w:type="table" w:styleId="ColorfulList-Accent4">
+  <w:style w:type="table" w:styleId="Listecouleur-Accent4">
     <w:name w:val="Colorful List Accent 4"/>
-    <w:basedOn w:val="TableNormal"/>
+    <w:basedOn w:val="TableauNormal"/>
     <w:uiPriority w:val="72"/>
     <w:rsid w:val="00CB0664"/>
     <w:pPr>
@@ -14134,9 +14611,9 @@
       </w:tcPr>
     </w:tblStylePr>
   </w:style>
-  <w:style w:type="table" w:styleId="ColorfulList-Accent5">
+  <w:style w:type="table" w:styleId="Listecouleur-Accent5">
     <w:name w:val="Colorful List Accent 5"/>
-    <w:basedOn w:val="TableNormal"/>
+    <w:basedOn w:val="TableauNormal"/>
     <w:uiPriority w:val="72"/>
     <w:rsid w:val="00CB0664"/>
     <w:pPr>
@@ -14213,9 +14690,9 @@
       </w:tcPr>
     </w:tblStylePr>
   </w:style>
-  <w:style w:type="table" w:styleId="ColorfulList-Accent6">
+  <w:style w:type="table" w:styleId="Listecouleur-Accent6">
     <w:name w:val="Colorful List Accent 6"/>
-    <w:basedOn w:val="TableNormal"/>
+    <w:basedOn w:val="TableauNormal"/>
     <w:uiPriority w:val="72"/>
     <w:rsid w:val="00CB0664"/>
     <w:pPr>
@@ -14292,9 +14769,9 @@
       </w:tcPr>
     </w:tblStylePr>
   </w:style>
-  <w:style w:type="table" w:styleId="ColorfulGrid">
+  <w:style w:type="table" w:styleId="Grillecouleur">
     <w:name w:val="Colorful Grid"/>
-    <w:basedOn w:val="TableNormal"/>
+    <w:basedOn w:val="TableauNormal"/>
     <w:uiPriority w:val="73"/>
     <w:rsid w:val="00CB0664"/>
     <w:pPr>
@@ -14365,9 +14842,9 @@
       </w:tcPr>
     </w:tblStylePr>
   </w:style>
-  <w:style w:type="table" w:styleId="ColorfulGrid-Accent1">
+  <w:style w:type="table" w:styleId="Grillecouleur-Accent1">
     <w:name w:val="Colorful Grid Accent 1"/>
-    <w:basedOn w:val="TableNormal"/>
+    <w:basedOn w:val="TableauNormal"/>
     <w:uiPriority w:val="73"/>
     <w:rsid w:val="00CB0664"/>
     <w:pPr>
@@ -14438,9 +14915,9 @@
       </w:tcPr>
     </w:tblStylePr>
   </w:style>
-  <w:style w:type="table" w:styleId="ColorfulGrid-Accent2">
+  <w:style w:type="table" w:styleId="Grillecouleur-Accent2">
     <w:name w:val="Colorful Grid Accent 2"/>
-    <w:basedOn w:val="TableNormal"/>
+    <w:basedOn w:val="TableauNormal"/>
     <w:uiPriority w:val="73"/>
     <w:rsid w:val="00CB0664"/>
     <w:pPr>
@@ -14511,9 +14988,9 @@
       </w:tcPr>
     </w:tblStylePr>
   </w:style>
-  <w:style w:type="table" w:styleId="ColorfulGrid-Accent3">
+  <w:style w:type="table" w:styleId="Grillecouleur-Accent3">
     <w:name w:val="Colorful Grid Accent 3"/>
-    <w:basedOn w:val="TableNormal"/>
+    <w:basedOn w:val="TableauNormal"/>
     <w:uiPriority w:val="73"/>
     <w:rsid w:val="00CB0664"/>
     <w:pPr>
@@ -14584,9 +15061,9 @@
       </w:tcPr>
     </w:tblStylePr>
   </w:style>
-  <w:style w:type="table" w:styleId="ColorfulGrid-Accent4">
+  <w:style w:type="table" w:styleId="Grillecouleur-Accent4">
     <w:name w:val="Colorful Grid Accent 4"/>
-    <w:basedOn w:val="TableNormal"/>
+    <w:basedOn w:val="TableauNormal"/>
     <w:uiPriority w:val="73"/>
     <w:rsid w:val="00CB0664"/>
     <w:pPr>
@@ -14657,9 +15134,9 @@
       </w:tcPr>
     </w:tblStylePr>
   </w:style>
-  <w:style w:type="table" w:styleId="ColorfulGrid-Accent5">
+  <w:style w:type="table" w:styleId="Grillecouleur-Accent5">
     <w:name w:val="Colorful Grid Accent 5"/>
-    <w:basedOn w:val="TableNormal"/>
+    <w:basedOn w:val="TableauNormal"/>
     <w:uiPriority w:val="73"/>
     <w:rsid w:val="00CB0664"/>
     <w:pPr>
@@ -14730,9 +15207,9 @@
       </w:tcPr>
     </w:tblStylePr>
   </w:style>
-  <w:style w:type="table" w:styleId="ColorfulGrid-Accent6">
+  <w:style w:type="table" w:styleId="Grillecouleur-Accent6">
     <w:name w:val="Colorful Grid Accent 6"/>
-    <w:basedOn w:val="TableNormal"/>
+    <w:basedOn w:val="TableauNormal"/>
     <w:uiPriority w:val="73"/>
     <w:rsid w:val="00CB0664"/>
     <w:pPr>
@@ -14803,9 +15280,9 @@
       </w:tcPr>
     </w:tblStylePr>
   </w:style>
-  <w:style w:type="character" w:styleId="Hyperlink">
+  <w:style w:type="character" w:styleId="Lienhypertexte">
     <w:name w:val="Hyperlink"/>
-    <w:basedOn w:val="DefaultParagraphFont"/>
+    <w:basedOn w:val="Policepardfaut"/>
     <w:uiPriority w:val="99"/>
     <w:unhideWhenUsed/>
     <w:rsid w:val="00542780"/>
@@ -14814,9 +15291,9 @@
       <w:u w:val="single"/>
     </w:rPr>
   </w:style>
-  <w:style w:type="character" w:styleId="UnresolvedMention">
+  <w:style w:type="character" w:styleId="Mentionnonrsolue">
     <w:name w:val="Unresolved Mention"/>
-    <w:basedOn w:val="DefaultParagraphFont"/>
+    <w:basedOn w:val="Policepardfaut"/>
     <w:uiPriority w:val="99"/>
     <w:semiHidden/>
     <w:unhideWhenUsed/>
@@ -14824,6 +15301,19 @@
     <w:rPr>
       <w:color w:val="605E5C"/>
       <w:shd w:val="clear" w:color="auto" w:fill="E1DFDD"/>
+    </w:rPr>
+  </w:style>
+  <w:style w:type="paragraph" w:styleId="NormalWeb">
+    <w:name w:val="Normal (Web)"/>
+    <w:basedOn w:val="Normal"/>
+    <w:uiPriority w:val="99"/>
+    <w:semiHidden/>
+    <w:unhideWhenUsed/>
+    <w:rsid w:val="008C70B7"/>
+    <w:rPr>
+      <w:rFonts w:ascii="Times New Roman" w:hAnsi="Times New Roman" w:cs="Times New Roman"/>
+      <w:sz w:val="24"/>
+      <w:szCs w:val="24"/>
     </w:rPr>
   </w:style>
 </w:styles>

</xml_diff>